<commit_message>
HRD-010 step 8: atomic Issues→Fixed migration + Status.md r7 + .env.example
HRD-010 row moved Issues.md → Fixed.md atomically per §11.4.19.
Status.md r6→r7: commons_storage now ✅ landed (M2 + HRD-010).
e2e_bluff_hunt: 14 PASS → 18 PASS (added E14/E15/E16 storage invariants).

The §107 covenant validated itself during this HRD: the E14 RLS test
discovered (and the implementer fixed) a real production RLS-bypass
bug in WithTenantContext where the bootstrap PG user (superuser)
silently bypassed FORCE ROW LEVEL SECURITY. Herald's RLS was a
PASS-bluff before this commit — caught only because the E14 test
asserted EXACT-1 row count, not >=1.

.env.example documents the new HERALD_DB_*, HERALD_PG_DSN, and
HERALD_REDIS_* variables. Dev defaults match quickstart compose's
ports (Postgres 24100, Redis 24200).

All siblings (.html/.docx/.pdf) regenerated per §11.4.65.

Co-Authored-By: Claude Opus 4.7 <noreply@anthropic.com>
</commit_message>
<xml_diff>
--- a/docs/Fixed.docx
+++ b/docs/Fixed.docx
@@ -7,10 +7,36 @@
         <w:pStyle w:val="Title"/>
       </w:pPr>
       <w:r>
-        <w:t xml:space="preserve">Herald — Fixed</w:t>
+        <w:t xml:space="preserve">Fixed</w:t>
       </w:r>
     </w:p>
-    <w:bookmarkStart w:id="11" w:name="herald--fixed"/>
+    <w:sdt>
+      <w:sdtPr>
+        <w:docPartObj>
+          <w:docPartGallery w:val="Table of Contents"/>
+          <w:docPartUnique/>
+        </w:docPartObj>
+      </w:sdtPr>
+      <w:sdtContent>
+        <w:p>
+          <w:pPr>
+            <w:pStyle w:val="TOCHeading"/>
+          </w:pPr>
+          <w:r>
+            <w:t xml:space="preserve">Table of Contents</w:t>
+          </w:r>
+        </w:p>
+        <w:p>
+          <w:r>
+            <w:fldChar w:fldCharType="begin" w:dirty="true"/>
+            <w:instrText xml:space="preserve">TOC \o "1-3" \h \z \u</w:instrText>
+            <w:fldChar w:fldCharType="separate"/>
+            <w:fldChar w:fldCharType="end"/>
+          </w:r>
+        </w:p>
+      </w:sdtContent>
+    </w:sdt>
+    <w:bookmarkStart w:id="11" w:name="herald-fixed"/>
     <w:p>
       <w:pPr>
         <w:pStyle w:val="Heading1"/>
@@ -22,7 +48,8 @@
     <w:tbl>
       <w:tblPr>
         <w:tblStyle w:val="Table"/>
-        <w:tblW w:type="auto" w:w="0"/>
+        <w:tblW w:type="pct" w:w="5000"/>
+        <w:tblLayout w:type="fixed"/>
         <w:tblLook w:firstRow="1" w:lastRow="0" w:firstColumn="0" w:lastColumn="0" w:noHBand="0" w:noVBand="0" w:val="0020"/>
       </w:tblPr>
       <w:tblGrid>
@@ -75,7 +102,7 @@
               <w:pStyle w:val="Compact"/>
             </w:pPr>
             <w:r>
-              <w:t xml:space="preserve">4</w:t>
+              <w:t xml:space="preserve">5</w:t>
             </w:r>
           </w:p>
         </w:tc>
@@ -171,10 +198,7 @@
               <w:pStyle w:val="Compact"/>
             </w:pPr>
             <w:r>
-              <w:t xml:space="preserve">Foundation M1 landed:</w:t>
-            </w:r>
-            <w:r>
-              <w:t xml:space="preserve"> </w:t>
+              <w:t xml:space="preserve">HRD-010 commons_storage live wiring landed. §107 covenant proved its worth: E14 RLS test discovered + caught a production RLS-bypass bug (root cause: bootstrap PG user bypasses RLS regardless of FORCE). Plus prior: Foundation M1 (</w:t>
             </w:r>
             <w:r>
               <w:rPr>
@@ -183,10 +207,7 @@
               <w:t xml:space="preserve">commons_constitution</w:t>
             </w:r>
             <w:r>
-              <w:t xml:space="preserve"> </w:t>
-            </w:r>
-            <w:r>
-              <w:t xml:space="preserve">(14 files, ~2.9k LOC, all green under -race). Spec V3 → Revision 7 (§44 Foundation contract). HRD-080 closed (I6 gate refinement + paired meta-test). Next: M2 Helix-stack submodule installs + Postgres wiring.</w:t>
+              <w:t xml:space="preserve">, 14 files, ~2.9k LOC, all green under -race); Spec V3 → Revision 7 (§44 Foundation contract); HRD-080 closed (I6 gate refinement + paired meta-test).</w:t>
             </w:r>
           </w:p>
         </w:tc>
@@ -243,7 +264,7 @@
               <w:pStyle w:val="Compact"/>
             </w:pPr>
             <w:r>
-              <w:t xml:space="preserve">HRD-008/-010/-011/-012/-015/-016/-018 (in_progress) + HRD-019..HRD-056 still open.</w:t>
+              <w:t xml:space="preserve">HRD-008/-011/-012/-015/-016/-018 (in_progress) + HRD-019..HRD-056 + HRD-081 + HRD-085..HRD-090 still open.</w:t>
             </w:r>
           </w:p>
         </w:tc>
@@ -267,7 +288,7 @@
               <w:pStyle w:val="Compact"/>
             </w:pPr>
             <w:r>
-              <w:t xml:space="preserve">HRD-001..HRD-007, HRD-009, HRD-009b, HRD-013, HRD-014, HRD-017, HRD-080 (and HRD-018 partial — M1 component landed)</w:t>
+              <w:t xml:space="preserve">HRD-001..HRD-007, HRD-009, HRD-009b, HRD-010, HRD-013, HRD-014, HRD-017, HRD-080 (and HRD-018 partial — M1 component landed)</w:t>
             </w:r>
           </w:p>
         </w:tc>
@@ -291,7 +312,7 @@
               <w:pStyle w:val="Compact"/>
             </w:pPr>
             <w:r>
-              <w:t xml:space="preserve">spec V1→V3 r7; Go module foundation + Foundation M1; universal §11.4.73 + §11.4.74 mandates propagated; I6 gate refined to allow Helix-stack submodules.</w:t>
+              <w:t xml:space="preserve">spec V1→V3 r7; Go module foundation + Foundation M1/M2/M3; HRD-010 commons_storage live wiring (pgx + RLS + queue + Redis + migrate CLI); universal §11.4.73 + §11.4.74 mandates propagated; I6 gate refined to allow Helix-stack submodules.</w:t>
             </w:r>
           </w:p>
         </w:tc>
@@ -372,7 +393,8 @@
     <w:tbl>
       <w:tblPr>
         <w:tblStyle w:val="Table"/>
-        <w:tblW w:type="auto" w:w="0"/>
+        <w:tblW w:type="pct" w:w="5000"/>
+        <w:tblLayout w:type="fixed"/>
         <w:tblLook w:firstRow="1" w:lastRow="0" w:firstColumn="0" w:lastColumn="0" w:noHBand="0" w:noVBand="0" w:val="0020"/>
       </w:tblPr>
       <w:tblGrid>
@@ -474,6 +496,94 @@
               <w:pStyle w:val="Compact"/>
             </w:pPr>
             <w:r>
+              <w:t xml:space="preserve">HRD-010</w:t>
+            </w:r>
+          </w:p>
+        </w:tc>
+        <w:tc>
+          <w:tcPr/>
+          <w:p>
+            <w:pPr>
+              <w:pStyle w:val="Compact"/>
+            </w:pPr>
+            <w:r>
+              <w:t xml:space="preserve">task</w:t>
+            </w:r>
+          </w:p>
+        </w:tc>
+        <w:tc>
+          <w:tcPr/>
+          <w:p>
+            <w:pPr>
+              <w:pStyle w:val="Compact"/>
+            </w:pPr>
+            <w:r>
+              <w:t xml:space="preserve">middle</w:t>
+            </w:r>
+          </w:p>
+        </w:tc>
+        <w:tc>
+          <w:tcPr/>
+          <w:p>
+            <w:pPr>
+              <w:pStyle w:val="Compact"/>
+            </w:pPr>
+            <w:r>
+              <w:t xml:space="preserve">commons_storage live wiring — pgx pool + RLS-enforcing WithTenantContext (discovered + fixed RLS-bypass bug via E14 falsifiability) + 9 migrations + background queue (digital.vasic.background bound via pgxTaskRepository) + Redis ACL (digital.vasic.cache) + pherald migrate up/status/down/validate subcommand + 3 new §107 e2e invariants (E14/E15/E16) + HRD-085..090 registered for queue-repository stubs</w:t>
+            </w:r>
+          </w:p>
+        </w:tc>
+        <w:tc>
+          <w:tcPr/>
+          <w:p>
+            <w:pPr>
+              <w:pStyle w:val="Compact"/>
+            </w:pPr>
+            <w:r>
+              <w:t xml:space="preserve">2026-05-20</w:t>
+            </w:r>
+          </w:p>
+        </w:tc>
+        <w:tc>
+          <w:tcPr/>
+          <w:p>
+            <w:pPr>
+              <w:pStyle w:val="Compact"/>
+            </w:pPr>
+            <w:r>
+              <w:t xml:space="preserve">(this commit)</w:t>
+            </w:r>
+          </w:p>
+        </w:tc>
+        <w:tc>
+          <w:tcPr/>
+          <w:p>
+            <w:pPr>
+              <w:pStyle w:val="Compact"/>
+            </w:pPr>
+            <w:r>
+              <w:t xml:space="preserve">spec V3 §9.6 + §16; Catalogue-Check: extend digital.vasic.database@</w:t>
+            </w:r>
+            <w:r>
+              <w:t xml:space="preserve"> </w:t>
+            </w:r>
+            <w:r>
+              <w:t xml:space="preserve">+ digital.vasic.background@2d46dd60 + digital.vasic.cache@</w:t>
+            </w:r>
+            <w:r>
+              <w:t xml:space="preserve">; Models + Concurrency submodules added</w:t>
+            </w:r>
+          </w:p>
+        </w:tc>
+      </w:tr>
+      <w:tr>
+        <w:tc>
+          <w:tcPr/>
+          <w:p>
+            <w:pPr>
+              <w:pStyle w:val="Compact"/>
+            </w:pPr>
+            <w:r>
               <w:t xml:space="preserve">HRD-080</w:t>
             </w:r>
           </w:p>
@@ -519,7 +629,13 @@
               <w:t xml:space="preserve">.gitmodules</w:t>
             </w:r>
             <w:r>
-              <w:t xml:space="preserve">-forbidden to "no</w:t>
+              <w:t xml:space="preserve">-forbidden to</w:t>
+            </w:r>
+            <w:r>
+              <w:t xml:space="preserve"> </w:t>
+            </w:r>
+            <w:r>
+              <w:t xml:space="preserve">“no</w:t>
             </w:r>
             <w:r>
               <w:t xml:space="preserve"> </w:t>
@@ -546,7 +662,13 @@
               <w:t xml:space="preserve">.gitmodules</w:t>
             </w:r>
             <w:r>
-              <w:t xml:space="preserve">" — paired meta-test</w:t>
+              <w:t xml:space="preserve">”</w:t>
+            </w:r>
+            <w:r>
+              <w:t xml:space="preserve"> </w:t>
+            </w:r>
+            <w:r>
+              <w:t xml:space="preserve">— paired meta-test</w:t>
             </w:r>
             <w:r>
               <w:t xml:space="preserve"> </w:t>
@@ -1590,7 +1712,10 @@
               <w:pStyle w:val="Compact"/>
             </w:pPr>
             <w:r>
-              <w:t xml:space="preserve">archive V1 §"Review"</w:t>
+              <w:t xml:space="preserve">archive V1 §</w:t>
+            </w:r>
+            <w:r>
+              <w:t xml:space="preserve">“Review”</w:t>
             </w:r>
           </w:p>
         </w:tc>

</xml_diff>

<commit_message>
docs: regenerate Issues/Fixed .html/.pdf/.docx siblings (HRD-090 closure + HRD-146/147)
Refresh the committed sibling artefacts to match Issues.md r39 + Fixed.md r18
(HRD-090 Issues→Fixed migration, HRD-146 + HRD-147 filings). Generated via
`scripts/export_docs.sh docs/Issues.md docs/Fixed.md` (pandoc 3.9 + weasyprint).
NOTE: the derived *_Summary.md files have no standalone generator in scripts/
and are left untouched (not hand-edited per CLAUDE.md docs policy) — flag for a
cherald docs-sync pass if their refresh is wanted.

Co-Authored-By: Claude Opus 4.8 <noreply@anthropic.com>
</commit_message>
<xml_diff>
--- a/docs/Fixed.docx
+++ b/docs/Fixed.docx
@@ -75,7 +75,7 @@
               <w:pStyle w:val="Compact"/>
             </w:pPr>
             <w:r>
-              <w:t xml:space="preserve">17</w:t>
+              <w:t xml:space="preserve">18</w:t>
             </w:r>
           </w:p>
         </w:tc>
@@ -175,301 +175,563 @@
                 <w:b/>
                 <w:bCs/>
               </w:rPr>
-              <w:t xml:space="preserve">r17 atomically lands (§11.4.19) the completed Wave 8 Track B (MTProto user-account harness for §11.4.98 full-automation testing) — HRD-139 (MTProto Client live wiring + qaherald mtproto CLI), HRD-140 (Subscribe roundtrip), HRD-141 (Wave 6 closed loop), HRD-142 (Wave 6.5 lifecycle) all New→Fixed (these HRDs were tracked directly in the TaskList rather than Issues.md and graduate directly into Fixed.md per §11.4.19 the moment closure landed).</w:t>
-            </w:r>
-            <w:r>
-              <w:t xml:space="preserve"> </w:t>
-            </w:r>
-            <w:r>
-              <w:t xml:space="preserve">Wave 8 Track B closure proves §11.4.98 (full-automation anti-bluff mandate) end-to-end: 3 MTProto-driven live tests (E135 Subscribe / E136 Wave 6 closed loop / E137 Wave 6.5 lifecycle) all PASSING LIVE under §11.4.98-pure interpretation, captured under</w:t>
-            </w:r>
-            <w:r>
-              <w:t xml:space="preserve"> </w:t>
-            </w:r>
-            <w:r>
-              <w:rPr>
-                <w:rStyle w:val="VerbatimChar"/>
-              </w:rPr>
-              <w:t xml:space="preserve">docs/qa/HRD-LIVE-MTPROTO-20260528T125321Z/</w:t>
-            </w:r>
-            <w:r>
-              <w:t xml:space="preserve">. Three legacy NON-COMPLIANT tests graduate to §11.4.90 Obsolete in Issues.md r36 with Obsolete-Details cite of §11.4.98 + §108.m superseding-mandate:</w:t>
-            </w:r>
-            <w:r>
-              <w:t xml:space="preserve"> </w:t>
-            </w:r>
-            <w:r>
-              <w:rPr>
-                <w:rStyle w:val="VerbatimChar"/>
-              </w:rPr>
-              <w:t xml:space="preserve">TestSubscribe_LiveBotAPI</w:t>
-            </w:r>
-            <w:r>
-              <w:t xml:space="preserve">,</w:t>
-            </w:r>
-            <w:r>
-              <w:t xml:space="preserve"> </w:t>
-            </w:r>
-            <w:r>
-              <w:rPr>
-                <w:rStyle w:val="VerbatimChar"/>
-              </w:rPr>
-              <w:t xml:space="preserve">tests/test_wave6_live_loop.sh</w:t>
-            </w:r>
-            <w:r>
-              <w:t xml:space="preserve">, lifecycle</w:t>
-            </w:r>
-            <w:r>
-              <w:t xml:space="preserve"> </w:t>
-            </w:r>
-            <w:r>
-              <w:rPr>
-                <w:rStyle w:val="VerbatimChar"/>
-              </w:rPr>
-              <w:t xml:space="preserve">--manual</w:t>
-            </w:r>
-            <w:r>
-              <w:t xml:space="preserve"> </w:t>
-            </w:r>
-            <w:r>
-              <w:t xml:space="preserve">mode. v0.6.0 tag (</w:t>
-            </w:r>
-            <w:r>
-              <w:rPr>
-                <w:rStyle w:val="VerbatimChar"/>
-              </w:rPr>
-              <w:t xml:space="preserve">844f340</w:t>
-            </w:r>
-            <w:r>
-              <w:t xml:space="preserve"> </w:t>
-            </w:r>
-            <w:r>
-              <w:t xml:space="preserve">annotated) was already cut on</w:t>
-            </w:r>
-            <w:r>
-              <w:t xml:space="preserve"> </w:t>
-            </w:r>
-            <w:r>
-              <w:rPr>
-                <w:rStyle w:val="VerbatimChar"/>
-              </w:rPr>
-              <w:t xml:space="preserve">d843ddf</w:t>
-            </w:r>
-            <w:r>
-              <w:t xml:space="preserve"> </w:t>
-            </w:r>
-            <w:r>
-              <w:t xml:space="preserve">covering Wave 8 Track B closure + the §11.4.98+§11.4.99 anchoring + 9-Helix-submodule §11.4.98+§11.4.99 propagation. Prior r16 atomically migrates (§11.4.19) the completed Tgram-completeness wave — HRD-133/134/135/136/137/138 (all 6 Tgram-completeness HRDs) Issues→Fixed.** Wave A: HRD-135 lifecycle handlers (</w:t>
-            </w:r>
-            <w:r>
-              <w:rPr>
-                <w:rStyle w:val="VerbatimChar"/>
-              </w:rPr>
-              <w:t xml:space="preserve">fe2a7c8</w:t>
-            </w:r>
-            <w:r>
-              <w:t xml:space="preserve"> </w:t>
-            </w:r>
-            <w:r>
-              <w:t xml:space="preserve">— OnEdited / OnMyChatMember / serviceHandler / ErrBotKicked sentinel) + HRD-136 webhook secret_token validator (</w:t>
-            </w:r>
-            <w:r>
-              <w:rPr>
-                <w:rStyle w:val="VerbatimChar"/>
-              </w:rPr>
-              <w:t xml:space="preserve">6d7d543</w:t>
-            </w:r>
-            <w:r>
-              <w:t xml:space="preserve"> </w:t>
-            </w:r>
-            <w:r>
-              <w:t xml:space="preserve">—</w:t>
-            </w:r>
-            <w:r>
-              <w:t xml:space="preserve"> </w:t>
-            </w:r>
-            <w:r>
-              <w:rPr>
-                <w:rStyle w:val="VerbatimChar"/>
-              </w:rPr>
-              <w:t xml:space="preserve">crypto/subtle.ConstantTimeCompare</w:t>
-            </w:r>
-            <w:r>
-              <w:t xml:space="preserve">, 401-no-leak posture) + HRD-138 operator deep-dive guide (</w:t>
-            </w:r>
-            <w:r>
-              <w:rPr>
-                <w:rStyle w:val="VerbatimChar"/>
-              </w:rPr>
-              <w:t xml:space="preserve">ff9b9c0</w:t>
-            </w:r>
-            <w:r>
-              <w:t xml:space="preserve"> </w:t>
-            </w:r>
-            <w:r>
-              <w:t xml:space="preserve">— 810-line</w:t>
-            </w:r>
-            <w:r>
-              <w:t xml:space="preserve"> </w:t>
-            </w:r>
-            <w:r>
-              <w:rPr>
-                <w:rStyle w:val="VerbatimChar"/>
-              </w:rPr>
-              <w:t xml:space="preserve">docs/guides/TELEGRAM.md</w:t>
-            </w:r>
-            <w:r>
-              <w:t xml:space="preserve">, 11 §-sections, 3 siblings). Wave B: HRD-133 token-redaction symmetry (</w:t>
-            </w:r>
-            <w:r>
-              <w:rPr>
-                <w:rStyle w:val="VerbatimChar"/>
-              </w:rPr>
-              <w:t xml:space="preserve">8162d14</w:t>
-            </w:r>
-            <w:r>
-              <w:t xml:space="preserve"> </w:t>
-            </w:r>
-            <w:r>
-              <w:t xml:space="preserve">—</w:t>
-            </w:r>
-            <w:r>
-              <w:t xml:space="preserve"> </w:t>
-            </w:r>
-            <w:r>
-              <w:rPr>
-                <w:rStyle w:val="VerbatimChar"/>
-              </w:rPr>
-              <w:t xml:space="preserve">sanitizeTgramError</w:t>
-            </w:r>
-            <w:r>
-              <w:t xml:space="preserve"> </w:t>
-            </w:r>
-            <w:r>
-              <w:t xml:space="preserve">wraps 6 error-return sites in Send/SendReply) + HRD-134 429 retry_after honored (</w:t>
-            </w:r>
-            <w:r>
-              <w:rPr>
-                <w:rStyle w:val="VerbatimChar"/>
-              </w:rPr>
-              <w:t xml:space="preserve">8162d14</w:t>
-            </w:r>
-            <w:r>
-              <w:t xml:space="preserve"> </w:t>
-            </w:r>
-            <w:r>
-              <w:t xml:space="preserve">combined —</w:t>
-            </w:r>
-            <w:r>
-              <w:t xml:space="preserve"> </w:t>
-            </w:r>
-            <w:r>
-              <w:rPr>
-                <w:rStyle w:val="VerbatimChar"/>
-              </w:rPr>
-              <w:t xml:space="preserve">withRetry429</w:t>
-            </w:r>
-            <w:r>
-              <w:t xml:space="preserve"> </w:t>
-            </w:r>
-            <w:r>
-              <w:t xml:space="preserve">wraps all 3 telebot</w:t>
-            </w:r>
-            <w:r>
-              <w:t xml:space="preserve"> </w:t>
-            </w:r>
-            <w:r>
-              <w:rPr>
-                <w:rStyle w:val="VerbatimChar"/>
-              </w:rPr>
-              <w:t xml:space="preserve">bot.Send</w:t>
-            </w:r>
-            <w:r>
-              <w:t xml:space="preserve"> </w:t>
-            </w:r>
-            <w:r>
-              <w:t xml:space="preserve">sites, telebot.FloodError typed extraction, ctx-aware sleep, 3-attempt 60s-clamp). Wave C: HRD-137 stress+chaos suite (this commit —</w:t>
-            </w:r>
-            <w:r>
-              <w:t xml:space="preserve"> </w:t>
-            </w:r>
-            <w:r>
-              <w:rPr>
-                <w:rStyle w:val="VerbatimChar"/>
-              </w:rPr>
-              <w:t xml:space="preserve">TestTgram_Stress_MultiRecipientFanOut</w:t>
-            </w:r>
-            <w:r>
-              <w:t xml:space="preserve"> </w:t>
-            </w:r>
-            <w:r>
-              <w:t xml:space="preserve">20×20=400 calls/20 chats deterministic +</w:t>
-            </w:r>
-            <w:r>
-              <w:t xml:space="preserve"> </w:t>
-            </w:r>
-            <w:r>
-              <w:rPr>
-                <w:rStyle w:val="VerbatimChar"/>
-              </w:rPr>
-              <w:t xml:space="preserve">TestTgram_Chaos_GetUpdatesPollerResilience</w:t>
-            </w:r>
-            <w:r>
-              <w:t xml:space="preserve"> </w:t>
-            </w:r>
-            <w:r>
-              <w:t xml:space="preserve">SKIP→PASS conversion via one-line</w:t>
-            </w:r>
-            <w:r>
-              <w:t xml:space="preserve"> </w:t>
-            </w:r>
-            <w:r>
-              <w:rPr>
-                <w:rStyle w:val="VerbatimChar"/>
-              </w:rPr>
-              <w:t xml:space="preserve">subscribe.go</w:t>
-            </w:r>
-            <w:r>
-              <w:t xml:space="preserve"> </w:t>
-            </w:r>
-            <w:r>
-              <w:t xml:space="preserve">baseURL seam fix; 8-phase fault matrix deterministic across</w:t>
-            </w:r>
-            <w:r>
-              <w:t xml:space="preserve"> </w:t>
-            </w:r>
-            <w:r>
-              <w:rPr>
-                <w:rStyle w:val="VerbatimChar"/>
-              </w:rPr>
-              <w:t xml:space="preserve">-race -count=3</w:t>
-            </w:r>
-            <w:r>
-              <w:t xml:space="preserve"> </w:t>
-            </w:r>
-            <w:r>
-              <w:t xml:space="preserve">— every iteration IDENTICAL</w:t>
-            </w:r>
-            <w:r>
-              <w:t xml:space="preserve"> </w:t>
-            </w:r>
-            <w:r>
-              <w:rPr>
-                <w:rStyle w:val="VerbatimChar"/>
-              </w:rPr>
-              <w:t xml:space="preserve">recovery=6 fault(500=12 hang=8 close=3 ok=6) goroutines 3→4</w:t>
-            </w:r>
-            <w:r>
-              <w:t xml:space="preserve">). Full tgram suite</w:t>
-            </w:r>
-            <w:r>
-              <w:t xml:space="preserve"> </w:t>
+              <w:t xml:space="preserve">r18 atomically lands (§11.4.19) HRD-090 dead-letter handling Completed→Fixed —</w:t>
             </w:r>
             <w:r>
               <w:rPr>
                 <w:b/>
                 <w:bCs/>
               </w:rPr>
+              <w:t xml:space="preserve"> </w:t>
+            </w:r>
+            <w:r>
+              <w:rPr>
+                <w:rStyle w:val="VerbatimChar"/>
+                <w:b/>
+                <w:bCs/>
+              </w:rPr>
+              <w:t xml:space="preserve">commons_infra.pgxTaskRepository.MoveToDeadLetter</w:t>
+            </w:r>
+            <w:r>
+              <w:rPr>
+                <w:b/>
+                <w:bCs/>
+              </w:rPr>
+              <w:t xml:space="preserve"> </w:t>
+            </w:r>
+            <w:r>
+              <w:rPr>
+                <w:b/>
+                <w:bCs/>
+              </w:rPr>
+              <w:t xml:space="preserve">(was the last Batch-D</w:t>
+            </w:r>
+            <w:r>
+              <w:rPr>
+                <w:b/>
+                <w:bCs/>
+              </w:rPr>
+              <w:t xml:space="preserve"> </w:t>
+            </w:r>
+            <w:r>
+              <w:rPr>
+                <w:rStyle w:val="VerbatimChar"/>
+                <w:b/>
+                <w:bCs/>
+              </w:rPr>
+              <w:t xml:space="preserve">ErrUnsupported</w:t>
+            </w:r>
+            <w:r>
+              <w:rPr>
+                <w:b/>
+                <w:bCs/>
+              </w:rPr>
+              <w:t xml:space="preserve"> </w:t>
+            </w:r>
+            <w:r>
+              <w:rPr>
+                <w:b/>
+                <w:bCs/>
+              </w:rPr>
+              <w:t xml:space="preserve">stub): migration</w:t>
+            </w:r>
+            <w:r>
+              <w:rPr>
+                <w:b/>
+                <w:bCs/>
+              </w:rPr>
+              <w:t xml:space="preserve"> </w:t>
+            </w:r>
+            <w:r>
+              <w:rPr>
+                <w:rStyle w:val="VerbatimChar"/>
+                <w:b/>
+                <w:bCs/>
+              </w:rPr>
+              <w:t xml:space="preserve">000014_dead_letter_tasks</w:t>
+            </w:r>
+            <w:r>
+              <w:rPr>
+                <w:b/>
+                <w:bCs/>
+              </w:rPr>
+              <w:t xml:space="preserve"> </w:t>
+            </w:r>
+            <w:r>
+              <w:rPr>
+                <w:b/>
+                <w:bCs/>
+              </w:rPr>
+              <w:t xml:space="preserve">+ tx-atomic JSONB-snapshot move + terminal-mark; new 13th OPERATIONAL constitution event class</w:t>
+            </w:r>
+            <w:r>
+              <w:rPr>
+                <w:b/>
+                <w:bCs/>
+              </w:rPr>
+              <w:t xml:space="preserve"> </w:t>
+            </w:r>
+            <w:r>
+              <w:rPr>
+                <w:rStyle w:val="VerbatimChar"/>
+                <w:b/>
+                <w:bCs/>
+              </w:rPr>
+              <w:t xml:space="preserve">ClassQueueDeadLetter</w:t>
+            </w:r>
+            <w:r>
+              <w:rPr>
+                <w:b/>
+                <w:bCs/>
+              </w:rPr>
+              <w:t xml:space="preserve"> </w:t>
+            </w:r>
+            <w:r>
+              <w:rPr>
+                <w:b/>
+                <w:bCs/>
+              </w:rPr>
+              <w:t xml:space="preserve">+</w:t>
+            </w:r>
+            <w:r>
+              <w:rPr>
+                <w:b/>
+                <w:bCs/>
+              </w:rPr>
+              <w:t xml:space="preserve"> </w:t>
+            </w:r>
+            <w:r>
+              <w:rPr>
+                <w:rStyle w:val="VerbatimChar"/>
+                <w:b/>
+                <w:bCs/>
+              </w:rPr>
+              <w:t xml:space="preserve">QueueEvent</w:t>
+            </w:r>
+            <w:r>
+              <w:rPr>
+                <w:b/>
+                <w:bCs/>
+              </w:rPr>
+              <w:t xml:space="preserve"> </w:t>
+            </w:r>
+            <w:r>
+              <w:rPr>
+                <w:b/>
+                <w:bCs/>
+              </w:rPr>
+              <w:t xml:space="preserve">+</w:t>
+            </w:r>
+            <w:r>
+              <w:rPr>
+                <w:b/>
+                <w:bCs/>
+              </w:rPr>
+              <w:t xml:space="preserve"> </w:t>
+            </w:r>
+            <w:r>
+              <w:rPr>
+                <w:rStyle w:val="VerbatimChar"/>
+                <w:b/>
+                <w:bCs/>
+              </w:rPr>
+              <w:t xml:space="preserve">DeadLetter()</w:t>
+            </w:r>
+            <w:r>
+              <w:rPr>
+                <w:b/>
+                <w:bCs/>
+              </w:rPr>
+              <w:t xml:space="preserve"> </w:t>
+            </w:r>
+            <w:r>
+              <w:rPr>
+                <w:b/>
+                <w:bCs/>
+              </w:rPr>
+              <w:t xml:space="preserve">emit (wired nil-tolerantly; governance §42.2 set unchanged). Four-layer closure: 3 unit + real-PG integration (3 sinks) + §11.4.85 stress/chaos (50 concurrent race-clean, atomic under fault) + paired §1.1 mutation gate (4/0) + e2e E138; commits</w:t>
+            </w:r>
+            <w:r>
+              <w:rPr>
+                <w:b/>
+                <w:bCs/>
+              </w:rPr>
+              <w:t xml:space="preserve"> </w:t>
+            </w:r>
+            <w:r>
+              <w:rPr>
+                <w:rStyle w:val="VerbatimChar"/>
+                <w:b/>
+                <w:bCs/>
+              </w:rPr>
+              <w:t xml:space="preserve">549261d</w:t>
+            </w:r>
+            <w:r>
+              <w:rPr>
+                <w:b/>
+                <w:bCs/>
+              </w:rPr>
+              <w:t xml:space="preserve">+</w:t>
+            </w:r>
+            <w:r>
+              <w:rPr>
+                <w:rStyle w:val="VerbatimChar"/>
+                <w:b/>
+                <w:bCs/>
+              </w:rPr>
+              <w:t xml:space="preserve">9c765f6</w:t>
+            </w:r>
+            <w:r>
+              <w:rPr>
+                <w:b/>
+                <w:bCs/>
+              </w:rPr>
+              <w:t xml:space="preserve">; evidence</w:t>
+            </w:r>
+            <w:r>
+              <w:rPr>
+                <w:b/>
+                <w:bCs/>
+              </w:rPr>
+              <w:t xml:space="preserve"> </w:t>
+            </w:r>
+            <w:r>
+              <w:rPr>
+                <w:rStyle w:val="VerbatimChar"/>
+                <w:b/>
+                <w:bCs/>
+              </w:rPr>
+              <w:t xml:space="preserve">docs/qa/HRD-090-20260529T052228Z/</w:t>
+            </w:r>
+            <w:r>
+              <w:rPr>
+                <w:b/>
+                <w:bCs/>
+              </w:rPr>
+              <w:t xml:space="preserve"> </w:t>
+            </w:r>
+            <w:r>
+              <w:rPr>
+                <w:b/>
+                <w:bCs/>
+              </w:rPr>
+              <w:t xml:space="preserve">+</w:t>
+            </w:r>
+            <w:r>
+              <w:rPr>
+                <w:b/>
+                <w:bCs/>
+              </w:rPr>
+              <w:t xml:space="preserve"> </w:t>
+            </w:r>
+            <w:r>
+              <w:rPr>
+                <w:rStyle w:val="VerbatimChar"/>
+                <w:b/>
+                <w:bCs/>
+              </w:rPr>
+              <w:t xml:space="preserve">docs/qa/HRD-090-stress-chaos-20260529T054500Z/</w:t>
+            </w:r>
+            <w:r>
+              <w:rPr>
+                <w:b/>
+                <w:bCs/>
+              </w:rPr>
+              <w:t xml:space="preserve">. Governance-plane subscriber follow-up = HRD-147 (Issues.md).</w:t>
+            </w:r>
+            <w:r>
+              <w:t xml:space="preserve"> </w:t>
+            </w:r>
+            <w:r>
+              <w:t xml:space="preserve">Prior r17 atomically lands (§11.4.19) the completed Wave 8 Track B (MTProto user-account harness for §11.4.98 full-automation testing) — HRD-139 (MTProto Client live wiring + qaherald mtproto CLI), HRD-140 (Subscribe roundtrip), HRD-141 (Wave 6 closed loop), HRD-142 (Wave 6.5 lifecycle) all New→Fixed (these HRDs were tracked directly in the TaskList rather than Issues.md and graduate directly into Fixed.md per §11.4.19 the moment closure landed).** Wave 8 Track B closure proves §11.4.98 (full-automation anti-bluff mandate) end-to-end: 3 MTProto-driven live tests (E135 Subscribe / E136 Wave 6 closed loop / E137 Wave 6.5 lifecycle) all PASSING LIVE under §11.4.98-pure interpretation, captured under</w:t>
+            </w:r>
+            <w:r>
+              <w:t xml:space="preserve"> </w:t>
+            </w:r>
+            <w:r>
+              <w:rPr>
+                <w:rStyle w:val="VerbatimChar"/>
+              </w:rPr>
+              <w:t xml:space="preserve">docs/qa/HRD-LIVE-MTPROTO-20260528T125321Z/</w:t>
+            </w:r>
+            <w:r>
+              <w:t xml:space="preserve">. Three legacy NON-COMPLIANT tests graduate to §11.4.90 Obsolete in Issues.md r36 with Obsolete-Details cite of §11.4.98 + §108.m superseding-mandate:</w:t>
+            </w:r>
+            <w:r>
+              <w:t xml:space="preserve"> </w:t>
+            </w:r>
+            <w:r>
+              <w:rPr>
+                <w:rStyle w:val="VerbatimChar"/>
+              </w:rPr>
+              <w:t xml:space="preserve">TestSubscribe_LiveBotAPI</w:t>
+            </w:r>
+            <w:r>
+              <w:t xml:space="preserve">,</w:t>
+            </w:r>
+            <w:r>
+              <w:t xml:space="preserve"> </w:t>
+            </w:r>
+            <w:r>
+              <w:rPr>
+                <w:rStyle w:val="VerbatimChar"/>
+              </w:rPr>
+              <w:t xml:space="preserve">tests/test_wave6_live_loop.sh</w:t>
+            </w:r>
+            <w:r>
+              <w:t xml:space="preserve">, lifecycle</w:t>
+            </w:r>
+            <w:r>
+              <w:t xml:space="preserve"> </w:t>
+            </w:r>
+            <w:r>
+              <w:rPr>
+                <w:rStyle w:val="VerbatimChar"/>
+              </w:rPr>
+              <w:t xml:space="preserve">--manual</w:t>
+            </w:r>
+            <w:r>
+              <w:t xml:space="preserve"> </w:t>
+            </w:r>
+            <w:r>
+              <w:t xml:space="preserve">mode. v0.6.0 tag (</w:t>
+            </w:r>
+            <w:r>
+              <w:rPr>
+                <w:rStyle w:val="VerbatimChar"/>
+              </w:rPr>
+              <w:t xml:space="preserve">844f340</w:t>
+            </w:r>
+            <w:r>
+              <w:t xml:space="preserve"> </w:t>
+            </w:r>
+            <w:r>
+              <w:t xml:space="preserve">annotated) was already cut on</w:t>
+            </w:r>
+            <w:r>
+              <w:t xml:space="preserve"> </w:t>
+            </w:r>
+            <w:r>
+              <w:rPr>
+                <w:rStyle w:val="VerbatimChar"/>
+              </w:rPr>
+              <w:t xml:space="preserve">d843ddf</w:t>
+            </w:r>
+            <w:r>
+              <w:t xml:space="preserve"> </w:t>
+            </w:r>
+            <w:r>
+              <w:t xml:space="preserve">covering Wave 8 Track B closure + the §11.4.98+§11.4.99 anchoring + 9-Helix-submodule §11.4.98+§11.4.99 propagation. Prior r16 atomically migrates (§11.4.19) the completed Tgram-completeness wave — HRD-133/134/135/136/137/138 (all 6 Tgram-completeness HRDs) Issues→Fixed.** Wave A: HRD-135 lifecycle handlers (</w:t>
+            </w:r>
+            <w:r>
+              <w:rPr>
+                <w:rStyle w:val="VerbatimChar"/>
+              </w:rPr>
+              <w:t xml:space="preserve">fe2a7c8</w:t>
+            </w:r>
+            <w:r>
+              <w:t xml:space="preserve"> </w:t>
+            </w:r>
+            <w:r>
+              <w:t xml:space="preserve">— OnEdited / OnMyChatMember / serviceHandler / ErrBotKicked sentinel) + HRD-136 webhook secret_token validator (</w:t>
+            </w:r>
+            <w:r>
+              <w:rPr>
+                <w:rStyle w:val="VerbatimChar"/>
+              </w:rPr>
+              <w:t xml:space="preserve">6d7d543</w:t>
+            </w:r>
+            <w:r>
+              <w:t xml:space="preserve"> </w:t>
+            </w:r>
+            <w:r>
+              <w:t xml:space="preserve">—</w:t>
+            </w:r>
+            <w:r>
+              <w:t xml:space="preserve"> </w:t>
+            </w:r>
+            <w:r>
+              <w:rPr>
+                <w:rStyle w:val="VerbatimChar"/>
+              </w:rPr>
+              <w:t xml:space="preserve">crypto/subtle.ConstantTimeCompare</w:t>
+            </w:r>
+            <w:r>
+              <w:t xml:space="preserve">, 401-no-leak posture) + HRD-138 operator deep-dive guide (</w:t>
+            </w:r>
+            <w:r>
+              <w:rPr>
+                <w:rStyle w:val="VerbatimChar"/>
+              </w:rPr>
+              <w:t xml:space="preserve">ff9b9c0</w:t>
+            </w:r>
+            <w:r>
+              <w:t xml:space="preserve"> </w:t>
+            </w:r>
+            <w:r>
+              <w:t xml:space="preserve">— 810-line</w:t>
+            </w:r>
+            <w:r>
+              <w:t xml:space="preserve"> </w:t>
+            </w:r>
+            <w:r>
+              <w:rPr>
+                <w:rStyle w:val="VerbatimChar"/>
+              </w:rPr>
+              <w:t xml:space="preserve">docs/guides/TELEGRAM.md</w:t>
+            </w:r>
+            <w:r>
+              <w:t xml:space="preserve">, 11 §-sections, 3 siblings). Wave B: HRD-133 token-redaction symmetry (</w:t>
+            </w:r>
+            <w:r>
+              <w:rPr>
+                <w:rStyle w:val="VerbatimChar"/>
+              </w:rPr>
+              <w:t xml:space="preserve">8162d14</w:t>
+            </w:r>
+            <w:r>
+              <w:t xml:space="preserve"> </w:t>
+            </w:r>
+            <w:r>
+              <w:t xml:space="preserve">—</w:t>
+            </w:r>
+            <w:r>
+              <w:t xml:space="preserve"> </w:t>
+            </w:r>
+            <w:r>
+              <w:rPr>
+                <w:rStyle w:val="VerbatimChar"/>
+              </w:rPr>
+              <w:t xml:space="preserve">sanitizeTgramError</w:t>
+            </w:r>
+            <w:r>
+              <w:t xml:space="preserve"> </w:t>
+            </w:r>
+            <w:r>
+              <w:t xml:space="preserve">wraps 6 error-return sites in Send/SendReply) + HRD-134 429 retry_after honored (</w:t>
+            </w:r>
+            <w:r>
+              <w:rPr>
+                <w:rStyle w:val="VerbatimChar"/>
+              </w:rPr>
+              <w:t xml:space="preserve">8162d14</w:t>
+            </w:r>
+            <w:r>
+              <w:t xml:space="preserve"> </w:t>
+            </w:r>
+            <w:r>
+              <w:t xml:space="preserve">combined —</w:t>
+            </w:r>
+            <w:r>
+              <w:t xml:space="preserve"> </w:t>
+            </w:r>
+            <w:r>
+              <w:rPr>
+                <w:rStyle w:val="VerbatimChar"/>
+              </w:rPr>
+              <w:t xml:space="preserve">withRetry429</w:t>
+            </w:r>
+            <w:r>
+              <w:t xml:space="preserve"> </w:t>
+            </w:r>
+            <w:r>
+              <w:t xml:space="preserve">wraps all 3 telebot</w:t>
+            </w:r>
+            <w:r>
+              <w:t xml:space="preserve"> </w:t>
+            </w:r>
+            <w:r>
+              <w:rPr>
+                <w:rStyle w:val="VerbatimChar"/>
+              </w:rPr>
+              <w:t xml:space="preserve">bot.Send</w:t>
+            </w:r>
+            <w:r>
+              <w:t xml:space="preserve"> </w:t>
+            </w:r>
+            <w:r>
+              <w:t xml:space="preserve">sites, telebot.FloodError typed extraction, ctx-aware sleep, 3-attempt 60s-clamp). Wave C: HRD-137 stress+chaos suite (this commit —</w:t>
+            </w:r>
+            <w:r>
+              <w:t xml:space="preserve"> </w:t>
+            </w:r>
+            <w:r>
+              <w:rPr>
+                <w:rStyle w:val="VerbatimChar"/>
+              </w:rPr>
+              <w:t xml:space="preserve">TestTgram_Stress_MultiRecipientFanOut</w:t>
+            </w:r>
+            <w:r>
+              <w:t xml:space="preserve"> </w:t>
+            </w:r>
+            <w:r>
+              <w:t xml:space="preserve">20×20=400 calls/20 chats deterministic +</w:t>
+            </w:r>
+            <w:r>
+              <w:t xml:space="preserve"> </w:t>
+            </w:r>
+            <w:r>
+              <w:rPr>
+                <w:rStyle w:val="VerbatimChar"/>
+              </w:rPr>
+              <w:t xml:space="preserve">TestTgram_Chaos_GetUpdatesPollerResilience</w:t>
+            </w:r>
+            <w:r>
+              <w:t xml:space="preserve"> </w:t>
+            </w:r>
+            <w:r>
+              <w:t xml:space="preserve">SKIP→PASS conversion via one-line</w:t>
+            </w:r>
+            <w:r>
+              <w:t xml:space="preserve"> </w:t>
+            </w:r>
+            <w:r>
+              <w:rPr>
+                <w:rStyle w:val="VerbatimChar"/>
+              </w:rPr>
+              <w:t xml:space="preserve">subscribe.go</w:t>
+            </w:r>
+            <w:r>
+              <w:t xml:space="preserve"> </w:t>
+            </w:r>
+            <w:r>
+              <w:t xml:space="preserve">baseURL seam fix; 8-phase fault matrix deterministic across</w:t>
+            </w:r>
+            <w:r>
+              <w:t xml:space="preserve"> </w:t>
+            </w:r>
+            <w:r>
+              <w:rPr>
+                <w:rStyle w:val="VerbatimChar"/>
+              </w:rPr>
+              <w:t xml:space="preserve">-race -count=3</w:t>
+            </w:r>
+            <w:r>
+              <w:t xml:space="preserve"> </w:t>
+            </w:r>
+            <w:r>
+              <w:t xml:space="preserve">— every iteration IDENTICAL</w:t>
+            </w:r>
+            <w:r>
+              <w:t xml:space="preserve"> </w:t>
+            </w:r>
+            <w:r>
+              <w:rPr>
+                <w:rStyle w:val="VerbatimChar"/>
+              </w:rPr>
+              <w:t xml:space="preserve">recovery=6 fault(500=12 hang=8 close=3 ok=6) goroutines 3→4</w:t>
+            </w:r>
+            <w:r>
+              <w:t xml:space="preserve">). Full tgram suite</w:t>
+            </w:r>
+            <w:r>
+              <w:t xml:space="preserve"> </w:t>
+            </w:r>
+            <w:r>
+              <w:rPr>
+                <w:b/>
+                <w:bCs/>
+              </w:rPr>
               <w:t xml:space="preserve">26/26 PASS, 0 SKIP</w:t>
             </w:r>
             <w:r>
@@ -1037,7 +1299,7 @@
               <w:pStyle w:val="Compact"/>
             </w:pPr>
             <w:r>
-              <w:t xml:space="preserve">HRD-008/-015 + HRD-019..HRD-025 + HRD-029..HRD-056 + HRD-081 + HRD-085..HRD-090 + HRD-115..HRD-121 + HRD-131 still open (31 items).</w:t>
+              <w:t xml:space="preserve">HRD-008/-015 + HRD-019..HRD-025 + HRD-029..HRD-056 + HRD-081 + HRD-085..HRD-089 + HRD-115..HRD-121 + HRD-131 + HRD-146 + HRD-147 still open (32 items; HRD-090 closed r18).</w:t>
             </w:r>
           </w:p>
         </w:tc>
@@ -1061,7 +1323,7 @@
               <w:pStyle w:val="Compact"/>
             </w:pPr>
             <w:r>
-              <w:t xml:space="preserve">HRD-001..HRD-007, HRD-009, HRD-009b, HRD-010, HRD-011, HRD-012, HRD-013, HRD-014, HRD-016, HRD-017, HRD-018, HRD-026, HRD-027, HRD-028, HRD-080, HRD-092, HRD-093, HRD-094, HRD-095, HRD-096, HRD-097, HRD-098, HRD-099, HRD-100, HRD-110, HRD-111, HRD-112, HRD-113, HRD-114, HRD-122, HRD-123, HRD-124, HRD-125, HRD-126, HRD-127, HRD-128, HRD-129, HRD-130, HRD-132, HRD-133, HRD-134, HRD-135, HRD-136, HRD-137, HRD-138, HRD-139, HRD-140, HRD-141, HRD-142</w:t>
+              <w:t xml:space="preserve">HRD-001..HRD-007, HRD-009, HRD-009b, HRD-010, HRD-011, HRD-012, HRD-013, HRD-014, HRD-016, HRD-017, HRD-018, HRD-026, HRD-027, HRD-028, HRD-080, HRD-090, HRD-092, HRD-093, HRD-094, HRD-095, HRD-096, HRD-097, HRD-098, HRD-099, HRD-100, HRD-110, HRD-111, HRD-112, HRD-113, HRD-114, HRD-122, HRD-123, HRD-124, HRD-125, HRD-126, HRD-127, HRD-128, HRD-129, HRD-130, HRD-132, HRD-133, HRD-134, HRD-135, HRD-136, HRD-137, HRD-138, HRD-139, HRD-140, HRD-141, HRD-142</w:t>
             </w:r>
           </w:p>
         </w:tc>
@@ -1298,6 +1560,407 @@
             </w:pPr>
             <w:r>
               <w:t xml:space="preserve">Reference</w:t>
+            </w:r>
+          </w:p>
+        </w:tc>
+      </w:tr>
+      <w:tr>
+        <w:tc>
+          <w:tcPr/>
+          <w:p>
+            <w:pPr>
+              <w:pStyle w:val="Compact"/>
+            </w:pPr>
+            <w:r>
+              <w:t xml:space="preserve">HRD-090</w:t>
+            </w:r>
+          </w:p>
+        </w:tc>
+        <w:tc>
+          <w:tcPr/>
+          <w:p>
+            <w:pPr>
+              <w:pStyle w:val="Compact"/>
+            </w:pPr>
+            <w:r>
+              <w:t xml:space="preserve">task</w:t>
+            </w:r>
+          </w:p>
+        </w:tc>
+        <w:tc>
+          <w:tcPr/>
+          <w:p>
+            <w:pPr>
+              <w:pStyle w:val="Compact"/>
+            </w:pPr>
+            <w:r>
+              <w:t xml:space="preserve">middle</w:t>
+            </w:r>
+          </w:p>
+        </w:tc>
+        <w:tc>
+          <w:tcPr/>
+          <w:p>
+            <w:pPr>
+              <w:pStyle w:val="Compact"/>
+            </w:pPr>
+            <w:r>
+              <w:t xml:space="preserve">Dead-letter handling on</w:t>
+            </w:r>
+            <w:r>
+              <w:t xml:space="preserve"> </w:t>
+            </w:r>
+            <w:r>
+              <w:rPr>
+                <w:rStyle w:val="VerbatimChar"/>
+              </w:rPr>
+              <w:t xml:space="preserve">commons_infra.pgxTaskRepository</w:t>
+            </w:r>
+            <w:r>
+              <w:t xml:space="preserve"> </w:t>
+            </w:r>
+            <w:r>
+              <w:t xml:space="preserve">—</w:t>
+            </w:r>
+            <w:r>
+              <w:t xml:space="preserve"> </w:t>
+            </w:r>
+            <w:r>
+              <w:rPr>
+                <w:rStyle w:val="VerbatimChar"/>
+              </w:rPr>
+              <w:t xml:space="preserve">MoveToDeadLetter</w:t>
+            </w:r>
+            <w:r>
+              <w:t xml:space="preserve"> </w:t>
+            </w:r>
+            <w:r>
+              <w:t xml:space="preserve">(was the last</w:t>
+            </w:r>
+            <w:r>
+              <w:t xml:space="preserve"> </w:t>
+            </w:r>
+            <w:r>
+              <w:rPr>
+                <w:rStyle w:val="VerbatimChar"/>
+              </w:rPr>
+              <w:t xml:space="preserve">ErrUnsupported</w:t>
+            </w:r>
+            <w:r>
+              <w:t xml:space="preserve"> </w:t>
+            </w:r>
+            <w:r>
+              <w:t xml:space="preserve">Batch-D stub). Migration</w:t>
+            </w:r>
+            <w:r>
+              <w:t xml:space="preserve"> </w:t>
+            </w:r>
+            <w:r>
+              <w:rPr>
+                <w:rStyle w:val="VerbatimChar"/>
+              </w:rPr>
+              <w:t xml:space="preserve">000014_dead_letter_tasks</w:t>
+            </w:r>
+            <w:r>
+              <w:t xml:space="preserve"> </w:t>
+            </w:r>
+            <w:r>
+              <w:t xml:space="preserve">(.up/.down, FK→background_tasks ON DELETE CASCADE, no tenant/RLS — queue infra). Tx-atomic move: INSERT a full JSONB task snapshot into</w:t>
+            </w:r>
+            <w:r>
+              <w:t xml:space="preserve"> </w:t>
+            </w:r>
+            <w:r>
+              <w:rPr>
+                <w:rStyle w:val="VerbatimChar"/>
+              </w:rPr>
+              <w:t xml:space="preserve">dead_letter_tasks</w:t>
+            </w:r>
+            <w:r>
+              <w:t xml:space="preserve"> </w:t>
+            </w:r>
+            <w:r>
+              <w:t xml:space="preserve">+ terminal-mark</w:t>
+            </w:r>
+            <w:r>
+              <w:t xml:space="preserve"> </w:t>
+            </w:r>
+            <w:r>
+              <w:rPr>
+                <w:rStyle w:val="VerbatimChar"/>
+              </w:rPr>
+              <w:t xml:space="preserve">background_tasks.status='dead_letter'</w:t>
+            </w:r>
+            <w:r>
+              <w:t xml:space="preserve"> </w:t>
+            </w:r>
+            <w:r>
+              <w:t xml:space="preserve">(soft-mark, NOT hard-DELETE, to preserve the events/snapshots FK children); JSONB passed as</w:t>
+            </w:r>
+            <w:r>
+              <w:t xml:space="preserve"> </w:t>
+            </w:r>
+            <w:r>
+              <w:rPr>
+                <w:rStyle w:val="VerbatimChar"/>
+              </w:rPr>
+              <w:t xml:space="preserve">string()</w:t>
+            </w:r>
+            <w:r>
+              <w:t xml:space="preserve"> </w:t>
+            </w:r>
+            <w:r>
+              <w:t xml:space="preserve">per the r23 SQLSTATE-22P02 lesson. New 13th OPERATIONAL constitution event class</w:t>
+            </w:r>
+            <w:r>
+              <w:t xml:space="preserve"> </w:t>
+            </w:r>
+            <w:r>
+              <w:rPr>
+                <w:rStyle w:val="VerbatimChar"/>
+              </w:rPr>
+              <w:t xml:space="preserve">ClassQueueDeadLetter</w:t>
+            </w:r>
+            <w:r>
+              <w:t xml:space="preserve"> </w:t>
+            </w:r>
+            <w:r>
+              <w:t xml:space="preserve">("queue.dead_letter") +</w:t>
+            </w:r>
+            <w:r>
+              <w:t xml:space="preserve"> </w:t>
+            </w:r>
+            <w:r>
+              <w:rPr>
+                <w:rStyle w:val="VerbatimChar"/>
+              </w:rPr>
+              <w:t xml:space="preserve">QueueEvent</w:t>
+            </w:r>
+            <w:r>
+              <w:t xml:space="preserve"> </w:t>
+            </w:r>
+            <w:r>
+              <w:t xml:space="preserve">payload +</w:t>
+            </w:r>
+            <w:r>
+              <w:t xml:space="preserve"> </w:t>
+            </w:r>
+            <w:r>
+              <w:rPr>
+                <w:rStyle w:val="VerbatimChar"/>
+              </w:rPr>
+              <w:t xml:space="preserve">DeadLetter()</w:t>
+            </w:r>
+            <w:r>
+              <w:t xml:space="preserve"> </w:t>
+            </w:r>
+            <w:r>
+              <w:t xml:space="preserve">emit method (governance set §42.2's 12 classes unchanged; count tests 12→13); wired nil-tolerantly into the repo via</w:t>
+            </w:r>
+            <w:r>
+              <w:t xml:space="preserve"> </w:t>
+            </w:r>
+            <w:r>
+              <w:rPr>
+                <w:rStyle w:val="VerbatimChar"/>
+              </w:rPr>
+              <w:t xml:space="preserve">newPgxTaskRepositoryWithEmitter</w:t>
+            </w:r>
+            <w:r>
+              <w:t xml:space="preserve"> </w:t>
+            </w:r>
+            <w:r>
+              <w:t xml:space="preserve">(boot.go keeps the nil-emitter — the Foundation plane has no governance bus+subscriber; emitting there would be an emit-into-the-void §107 bluff; governance-plane subscriber is HRD-147 follow-up). Best-effort emit AFTER the durable commit — surfaced as an error, never swallowed.</w:t>
+            </w:r>
+            <w:r>
+              <w:t xml:space="preserve"> </w:t>
+            </w:r>
+            <w:r>
+              <w:rPr>
+                <w:b/>
+                <w:bCs/>
+              </w:rPr>
+              <w:t xml:space="preserve">Four-layer closure (CONST-048):</w:t>
+            </w:r>
+            <w:r>
+              <w:t xml:space="preserve"> </w:t>
+            </w:r>
+            <w:r>
+              <w:t xml:space="preserve">3 hermetic unit tests + real-PG integration (</w:t>
+            </w:r>
+            <w:r>
+              <w:rPr>
+                <w:rStyle w:val="VerbatimChar"/>
+              </w:rPr>
+              <w:t xml:space="preserve">TestRepoMoveToDeadLetter_RoundTripAndEmit</w:t>
+            </w:r>
+            <w:r>
+              <w:t xml:space="preserve">, 3 independent sinks: source terminal-state + dlq snapshot + real-bus</w:t>
+            </w:r>
+            <w:r>
+              <w:t xml:space="preserve"> </w:t>
+            </w:r>
+            <w:r>
+              <w:rPr>
+                <w:rStyle w:val="VerbatimChar"/>
+              </w:rPr>
+              <w:t xml:space="preserve">.queue.dead_letter</w:t>
+            </w:r>
+            <w:r>
+              <w:t xml:space="preserve"> </w:t>
+            </w:r>
+            <w:r>
+              <w:t xml:space="preserve">delivery) + §11.4.85 stress/chaos (50 concurrent moves race-clean, emit-failure-atomic, cancelled-ctx-no-orphan) + paired §1.1 mutation gate (</w:t>
+            </w:r>
+            <w:r>
+              <w:rPr>
+                <w:rStyle w:val="VerbatimChar"/>
+              </w:rPr>
+              <w:t xml:space="preserve">tests/test_hrd090_mutation_meta.sh</w:t>
+            </w:r>
+            <w:r>
+              <w:t xml:space="preserve">, 4/0) + e2e E138. All</w:t>
+            </w:r>
+            <w:r>
+              <w:t xml:space="preserve"> </w:t>
+            </w:r>
+            <w:r>
+              <w:rPr>
+                <w:rStyle w:val="VerbatimChar"/>
+              </w:rPr>
+              <w:t xml:space="preserve">-race</w:t>
+            </w:r>
+            <w:r>
+              <w:t xml:space="preserve"> </w:t>
+            </w:r>
+            <w:r>
+              <w:t xml:space="preserve">green.</w:t>
+            </w:r>
+          </w:p>
+        </w:tc>
+        <w:tc>
+          <w:tcPr/>
+          <w:p>
+            <w:pPr>
+              <w:pStyle w:val="Compact"/>
+            </w:pPr>
+            <w:r>
+              <w:t xml:space="preserve">2026-05-29</w:t>
+            </w:r>
+          </w:p>
+        </w:tc>
+        <w:tc>
+          <w:tcPr/>
+          <w:p>
+            <w:pPr>
+              <w:pStyle w:val="Compact"/>
+            </w:pPr>
+            <w:r>
+              <w:rPr>
+                <w:rStyle w:val="VerbatimChar"/>
+              </w:rPr>
+              <w:t xml:space="preserve">549261d</w:t>
+            </w:r>
+            <w:r>
+              <w:t xml:space="preserve"> </w:t>
+            </w:r>
+            <w:r>
+              <w:t xml:space="preserve">(impl + event class) +</w:t>
+            </w:r>
+            <w:r>
+              <w:t xml:space="preserve"> </w:t>
+            </w:r>
+            <w:r>
+              <w:rPr>
+                <w:rStyle w:val="VerbatimChar"/>
+              </w:rPr>
+              <w:t xml:space="preserve">9c765f6</w:t>
+            </w:r>
+            <w:r>
+              <w:t xml:space="preserve"> </w:t>
+            </w:r>
+            <w:r>
+              <w:t xml:space="preserve">(stress/chaos + mutation gate + e2e E138)</w:t>
+            </w:r>
+          </w:p>
+        </w:tc>
+        <w:tc>
+          <w:tcPr/>
+          <w:p>
+            <w:pPr>
+              <w:pStyle w:val="Compact"/>
+            </w:pPr>
+            <w:r>
+              <w:t xml:space="preserve">spec V3 §44 + §42.1; upstream</w:t>
+            </w:r>
+            <w:r>
+              <w:t xml:space="preserve"> </w:t>
+            </w:r>
+            <w:r>
+              <w:rPr>
+                <w:rStyle w:val="VerbatimChar"/>
+              </w:rPr>
+              <w:t xml:space="preserve">background.TaskRepository</w:t>
+            </w:r>
+            <w:r>
+              <w:t xml:space="preserve"> </w:t>
+            </w:r>
+            <w:r>
+              <w:t xml:space="preserve">(</w:t>
+            </w:r>
+            <w:r>
+              <w:rPr>
+                <w:rStyle w:val="VerbatimChar"/>
+              </w:rPr>
+              <w:t xml:space="preserve">submodules/background/interfaces.go</w:t>
+            </w:r>
+            <w:r>
+              <w:t xml:space="preserve">); Universal §11.4.85 + §1.1 + CONST-048 (inherited per §11.4.35); evidence</w:t>
+            </w:r>
+            <w:r>
+              <w:t xml:space="preserve"> </w:t>
+            </w:r>
+            <w:r>
+              <w:rPr>
+                <w:rStyle w:val="VerbatimChar"/>
+              </w:rPr>
+              <w:t xml:space="preserve">docs/qa/HRD-090-20260529T052228Z/</w:t>
+            </w:r>
+            <w:r>
+              <w:t xml:space="preserve"> </w:t>
+            </w:r>
+            <w:r>
+              <w:t xml:space="preserve">(real-PG round-trip) +</w:t>
+            </w:r>
+            <w:r>
+              <w:t xml:space="preserve"> </w:t>
+            </w:r>
+            <w:r>
+              <w:rPr>
+                <w:rStyle w:val="VerbatimChar"/>
+              </w:rPr>
+              <w:t xml:space="preserve">docs/qa/HRD-090-stress-chaos-20260529T054500Z/stress_chaos/</w:t>
+            </w:r>
+            <w:r>
+              <w:t xml:space="preserve"> </w:t>
+            </w:r>
+            <w:r>
+              <w:t xml:space="preserve">(QA-ANCHOR HRD-090-STRESS-CHAOS-20260529); follow-up HRD-147 (governance-plane subscriber); Catalogue-Check: extend</w:t>
+            </w:r>
+            <w:r>
+              <w:t xml:space="preserve"> </w:t>
+            </w:r>
+            <w:r>
+              <w:rPr>
+                <w:rStyle w:val="VerbatimChar"/>
+              </w:rPr>
+              <w:t xml:space="preserve">digital.vasic.background.TaskRepository@2d46dd6</w:t>
+            </w:r>
+            <w:r>
+              <w:t xml:space="preserve"> </w:t>
+            </w:r>
+            <w:r>
+              <w:t xml:space="preserve">(failure-terminal surface).</w:t>
             </w:r>
           </w:p>
         </w:tc>

</xml_diff>

<commit_message>
docs(§11.4.19): migrate HRD-146 + HRD-147 Issues→Fixed — both completed this session
The closure-migration stream correctly left these open (they were mid-flight in parallel streams when it ran). Now done + integrated + tested, so migrated: HRD-146 (pherald listen dispatch hardening — 120s timeout + process-group kill on the claude_code dispatcher; real 30s-shim killed in 702ms; a975d8b) + HRD-147 (governance dead-letter subscriber + DeadLetterSink + real emitter wiring in boot.go; 8 tests; 9ef4be9). Issues.md r43→r44, Fixed.md r19→r20, Status.md r18→r19; 15 open. Integrity verified: no HRD in both Issues-open and Fixed; §107.y quiescence clean. Siblings + summaries regenerated.

Co-Authored-By: Claude Opus 4.8 <noreply@anthropic.com>
</commit_message>
<xml_diff>
--- a/docs/Fixed.docx
+++ b/docs/Fixed.docx
@@ -75,7 +75,7 @@
               <w:pStyle w:val="Compact"/>
             </w:pPr>
             <w:r>
-              <w:t xml:space="preserve">19</w:t>
+              <w:t xml:space="preserve">20</w:t>
             </w:r>
           </w:p>
         </w:tc>
@@ -175,715 +175,855 @@
                 <w:b/>
                 <w:bCs/>
               </w:rPr>
-              <w:t xml:space="preserve">r19 (v1.0.0 closure-migration) atomically lands (§11.4.19) 51 code-verified HRDs Issues→Fixed after a re-verification audit (grep/read the impl + run the test + confirm the matching e2e invariant + confirm the</w:t>
-            </w:r>
-            <w:r>
-              <w:rPr>
+              <w:t xml:space="preserve">r20: lands HRD-146 (</w:t>
+            </w:r>
+            <w:r>
+              <w:rPr>
+                <w:rStyle w:val="VerbatimChar"/>
                 <w:b/>
                 <w:bCs/>
               </w:rPr>
-              <w:t xml:space="preserve"> </w:t>
-            </w:r>
-            <w:r>
-              <w:rPr>
-                <w:rStyle w:val="VerbatimChar"/>
+              <w:t xml:space="preserve">pherald listen</w:t>
+            </w:r>
+            <w:r>
+              <w:rPr>
                 <w:b/>
                 <w:bCs/>
               </w:rPr>
-              <w:t xml:space="preserve">docs/qa/&lt;run-id&gt;/</w:t>
+              <w:t xml:space="preserve"> </w:t>
             </w:r>
             <w:r>
               <w:rPr>
                 <w:b/>
                 <w:bCs/>
               </w:rPr>
-              <w:t xml:space="preserve"> </w:t>
+              <w:t xml:space="preserve">dispatch hardening — 120s timeout + process-group kill on the claude_code dispatcher,</w:t>
             </w:r>
             <w:r>
               <w:rPr>
                 <w:b/>
                 <w:bCs/>
               </w:rPr>
-              <w:t xml:space="preserve">dir; nothing migrated on self-reported status alone). The 51:</w:t>
-            </w:r>
-            <w:r>
-              <w:t xml:space="preserve"> </w:t>
-            </w:r>
-            <w:r>
-              <w:t xml:space="preserve">the 7 flavor constitution bindings HRD-019..025 (</w:t>
-            </w:r>
-            <w:r>
-              <w:rPr>
-                <w:rStyle w:val="VerbatimChar"/>
-              </w:rPr>
-              <w:t xml:space="preserve">&lt;flavor&gt;/internal/bindings</w:t>
-            </w:r>
-            <w:r>
-              <w:t xml:space="preserve"> </w:t>
-            </w:r>
-            <w:r>
-              <w:t xml:space="preserve">Pipelines; 7/7 bindings test suites PASS</w:t>
-            </w:r>
-            <w:r>
-              <w:t xml:space="preserve"> </w:t>
-            </w:r>
-            <w:r>
-              <w:rPr>
-                <w:rStyle w:val="VerbatimChar"/>
-              </w:rPr>
-              <w:t xml:space="preserve">-race</w:t>
-            </w:r>
-            <w:r>
-              <w:t xml:space="preserve">; e2e E90-E96; per-HRD</w:t>
-            </w:r>
-            <w:r>
-              <w:t xml:space="preserve"> </w:t>
-            </w:r>
-            <w:r>
-              <w:rPr>
-                <w:rStyle w:val="VerbatimChar"/>
-              </w:rPr>
-              <w:t xml:space="preserve">docs/qa/</w:t>
-            </w:r>
-            <w:r>
-              <w:t xml:space="preserve">); the entire §43 command catalogue HRD-029..056 (30 commands wired into Cobra roots via</w:t>
-            </w:r>
-            <w:r>
-              <w:t xml:space="preserve"> </w:t>
-            </w:r>
-            <w:r>
-              <w:rPr>
-                <w:rStyle w:val="VerbatimChar"/>
-              </w:rPr>
-              <w:t xml:space="preserve">registerGitOps</w:t>
-            </w:r>
-            <w:r>
-              <w:t xml:space="preserve">/</w:t>
-            </w:r>
-            <w:r>
-              <w:rPr>
-                <w:rStyle w:val="VerbatimChar"/>
-              </w:rPr>
-              <w:t xml:space="preserve">registerSysOps</w:t>
-            </w:r>
-            <w:r>
-              <w:t xml:space="preserve">/etc., cmd-test suites PASS, e2e E97-E122, per-HRD</w:t>
-            </w:r>
-            <w:r>
-              <w:t xml:space="preserve"> </w:t>
-            </w:r>
-            <w:r>
-              <w:rPr>
-                <w:rStyle w:val="VerbatimChar"/>
-              </w:rPr>
-              <w:t xml:space="preserve">docs/qa/</w:t>
-            </w:r>
-            <w:r>
-              <w:t xml:space="preserve">); the Batch-D</w:t>
-            </w:r>
-            <w:r>
-              <w:t xml:space="preserve"> </w:t>
-            </w:r>
-            <w:r>
-              <w:rPr>
-                <w:rStyle w:val="VerbatimChar"/>
-              </w:rPr>
-              <w:t xml:space="preserve">commons_infra.pgxTaskRepository</w:t>
-            </w:r>
-            <w:r>
-              <w:t xml:space="preserve"> </w:t>
-            </w:r>
-            <w:r>
-              <w:t xml:space="preserve">ops HRD-085..089 (all 15 methods real impls not</w:t>
-            </w:r>
-            <w:r>
-              <w:t xml:space="preserve"> </w:t>
-            </w:r>
-            <w:r>
-              <w:rPr>
-                <w:rStyle w:val="VerbatimChar"/>
-              </w:rPr>
-              <w:t xml:space="preserve">ErrUnsupported</w:t>
-            </w:r>
-            <w:r>
-              <w:t xml:space="preserve">, migration</w:t>
-            </w:r>
-            <w:r>
-              <w:t xml:space="preserve"> </w:t>
-            </w:r>
-            <w:r>
-              <w:rPr>
-                <w:rStyle w:val="VerbatimChar"/>
-              </w:rPr>
-              <w:t xml:space="preserve">000013_task_resource_snapshots</w:t>
-            </w:r>
-            <w:r>
-              <w:t xml:space="preserve">, e2e E123,</w:t>
-            </w:r>
-            <w:r>
-              <w:t xml:space="preserve"> </w:t>
-            </w:r>
-            <w:r>
-              <w:rPr>
-                <w:rStyle w:val="VerbatimChar"/>
-              </w:rPr>
-              <w:t xml:space="preserve">docs/qa/HRD-085-089-*</w:t>
-            </w:r>
-            <w:r>
-              <w:t xml:space="preserve">); Wave 7 HRD-116/118/119/120/121 (qaherald Slack</w:t>
-            </w:r>
-            <w:r>
-              <w:t xml:space="preserve"> </w:t>
-            </w:r>
-            <w:r>
-              <w:rPr>
-                <w:rStyle w:val="VerbatimChar"/>
-              </w:rPr>
-              <w:t xml:space="preserve">MessengerClient</w:t>
-            </w:r>
-            <w:r>
-              <w:t xml:space="preserve"> </w:t>
-            </w:r>
-            <w:r>
-              <w:t xml:space="preserve">+ e2e E124-E131 + paired §1.1 gate</w:t>
-            </w:r>
-            <w:r>
-              <w:t xml:space="preserve"> </w:t>
-            </w:r>
-            <w:r>
-              <w:rPr>
-                <w:rStyle w:val="VerbatimChar"/>
-              </w:rPr>
-              <w:t xml:space="preserve">tests/test_wave7_mutation_meta.sh</w:t>
-            </w:r>
-            <w:r>
-              <w:t xml:space="preserve"> </w:t>
-            </w:r>
-            <w:r>
-              <w:t xml:space="preserve">+ multi-channel §11.4.85 stress/chaos +</w:t>
-            </w:r>
-            <w:r>
-              <w:t xml:space="preserve"> </w:t>
-            </w:r>
-            <w:r>
-              <w:rPr>
-                <w:rStyle w:val="VerbatimChar"/>
-              </w:rPr>
-              <w:t xml:space="preserve">MESSENGER_CHANNELS.md</w:t>
-            </w:r>
-            <w:r>
-              <w:t xml:space="preserve"> </w:t>
-            </w:r>
-            <w:r>
-              <w:t xml:space="preserve">guide; all hermetic tests PASS); ATMOSphere features HRD-148/149/151/152/153/154 (</w:t>
-            </w:r>
-            <w:r>
-              <w:rPr>
-                <w:rStyle w:val="VerbatimChar"/>
-              </w:rPr>
-              <w:t xml:space="preserve">commons_workable</w:t>
-            </w:r>
-            <w:r>
-              <w:t xml:space="preserve">+</w:t>
-            </w:r>
-            <w:r>
-              <w:rPr>
-                <w:rStyle w:val="VerbatimChar"/>
-              </w:rPr>
-              <w:t xml:space="preserve">commons_watch</w:t>
-            </w:r>
-            <w:r>
-              <w:t xml:space="preserve"> </w:t>
-            </w:r>
-            <w:r>
-              <w:t xml:space="preserve">build+test PASS, change→CloudEvent→Runner bridge + inbound action registry +</w:t>
-            </w:r>
-            <w:r>
-              <w:t xml:space="preserve"> </w:t>
-            </w:r>
-            <w:r>
-              <w:rPr>
-                <w:rStyle w:val="VerbatimChar"/>
-              </w:rPr>
-              <w:t xml:space="preserve">pherald watch</w:t>
-            </w:r>
-            <w:r>
-              <w:t xml:space="preserve"> </w:t>
-            </w:r>
-            <w:r>
-              <w:t xml:space="preserve">daemon + quiet-hours resolver, e2e E139</w:t>
-            </w:r>
-            <w:r>
-              <w:t xml:space="preserve"> </w:t>
-            </w:r>
-            <w:r>
-              <w:rPr>
-                <w:rStyle w:val="VerbatimChar"/>
-              </w:rPr>
-              <w:t xml:space="preserve">TestRunWatch_EndToEndOutbound</w:t>
-            </w:r>
-            <w:r>
-              <w:t xml:space="preserve"> </w:t>
-            </w:r>
-            <w:r>
-              <w:t xml:space="preserve">PASS hermetic).</w:t>
-            </w:r>
-            <w:r>
-              <w:t xml:space="preserve"> </w:t>
-            </w:r>
-            <w:r>
-              <w:rPr>
+              <w:t xml:space="preserve"> </w:t>
+            </w:r>
+            <w:r>
+              <w:rPr>
+                <w:rStyle w:val="VerbatimChar"/>
                 <w:b/>
                 <w:bCs/>
               </w:rPr>
-              <w:t xml:space="preserve">NOT migrated (evidence-gated, left in Issues.md):</w:t>
-            </w:r>
-            <w:r>
-              <w:t xml:space="preserve"> </w:t>
-            </w:r>
-            <w:r>
-              <w:t xml:space="preserve">HRD-115 (Slack channel adapter — operator-gated on LIVE</w:t>
-            </w:r>
-            <w:r>
-              <w:t xml:space="preserve"> </w:t>
-            </w:r>
-            <w:r>
-              <w:rPr>
-                <w:rStyle w:val="VerbatimChar"/>
-              </w:rPr>
-              <w:t xml:space="preserve">docs/qa/HRD-115-LIVE-*/</w:t>
-            </w:r>
-            <w:r>
-              <w:t xml:space="preserve"> </w:t>
-            </w:r>
-            <w:r>
-              <w:t xml:space="preserve">round-trip evidence per §107.x; only hermetic transcript exists, E127 LIVE-Slack SKIP-with-reason — closing now would be a §107 PASS-bluff); HRD-117 (spec V3 doc-only — §106); HRD-131/150/155/156/157/158 (externally gated); HRD-146/147/081/008/015 (not-started/upstream/operator). Prior r18 atomically lands (§11.4.19) HRD-090 dead-letter handling Completed→Fixed —</w:t>
-            </w:r>
-            <w:r>
-              <w:t xml:space="preserve"> </w:t>
-            </w:r>
-            <w:r>
-              <w:rPr>
-                <w:rStyle w:val="VerbatimChar"/>
-              </w:rPr>
-              <w:t xml:space="preserve">commons_infra.pgxTaskRepository.MoveToDeadLetter</w:t>
-            </w:r>
-            <w:r>
-              <w:t xml:space="preserve"> </w:t>
-            </w:r>
-            <w:r>
-              <w:t xml:space="preserve">(was the last Batch-D</w:t>
-            </w:r>
-            <w:r>
-              <w:t xml:space="preserve"> </w:t>
-            </w:r>
-            <w:r>
-              <w:rPr>
-                <w:rStyle w:val="VerbatimChar"/>
-              </w:rPr>
-              <w:t xml:space="preserve">ErrUnsupported</w:t>
-            </w:r>
-            <w:r>
-              <w:t xml:space="preserve"> </w:t>
-            </w:r>
-            <w:r>
-              <w:t xml:space="preserve">stub): migration</w:t>
-            </w:r>
-            <w:r>
-              <w:t xml:space="preserve"> </w:t>
-            </w:r>
-            <w:r>
-              <w:rPr>
-                <w:rStyle w:val="VerbatimChar"/>
-              </w:rPr>
-              <w:t xml:space="preserve">000014_dead_letter_tasks</w:t>
-            </w:r>
-            <w:r>
-              <w:t xml:space="preserve"> </w:t>
-            </w:r>
-            <w:r>
-              <w:t xml:space="preserve">+ tx-atomic JSONB-snapshot move + terminal-mark; new 13th OPERATIONAL constitution event class</w:t>
-            </w:r>
-            <w:r>
-              <w:t xml:space="preserve"> </w:t>
-            </w:r>
-            <w:r>
-              <w:rPr>
-                <w:rStyle w:val="VerbatimChar"/>
-              </w:rPr>
-              <w:t xml:space="preserve">ClassQueueDeadLetter</w:t>
-            </w:r>
-            <w:r>
-              <w:t xml:space="preserve"> </w:t>
-            </w:r>
-            <w:r>
-              <w:t xml:space="preserve">+</w:t>
-            </w:r>
-            <w:r>
-              <w:t xml:space="preserve"> </w:t>
-            </w:r>
-            <w:r>
-              <w:rPr>
-                <w:rStyle w:val="VerbatimChar"/>
-              </w:rPr>
-              <w:t xml:space="preserve">QueueEvent</w:t>
-            </w:r>
-            <w:r>
-              <w:t xml:space="preserve"> </w:t>
-            </w:r>
-            <w:r>
-              <w:t xml:space="preserve">+</w:t>
-            </w:r>
-            <w:r>
-              <w:t xml:space="preserve"> </w:t>
-            </w:r>
-            <w:r>
-              <w:rPr>
-                <w:rStyle w:val="VerbatimChar"/>
-              </w:rPr>
-              <w:t xml:space="preserve">DeadLetter()</w:t>
-            </w:r>
-            <w:r>
-              <w:t xml:space="preserve"> </w:t>
-            </w:r>
-            <w:r>
-              <w:t xml:space="preserve">emit (wired nil-tolerantly; governance §42.2 set unchanged). Four-layer closure: 3 unit + real-PG integration (3 sinks) + §11.4.85 stress/chaos (50 concurrent race-clean, atomic under fault) + paired §1.1 mutation gate (4/0) + e2e E138; commits</w:t>
-            </w:r>
-            <w:r>
-              <w:t xml:space="preserve"> </w:t>
-            </w:r>
-            <w:r>
-              <w:rPr>
-                <w:rStyle w:val="VerbatimChar"/>
-              </w:rPr>
-              <w:t xml:space="preserve">549261d</w:t>
-            </w:r>
-            <w:r>
-              <w:t xml:space="preserve">+</w:t>
-            </w:r>
-            <w:r>
-              <w:rPr>
-                <w:rStyle w:val="VerbatimChar"/>
-              </w:rPr>
-              <w:t xml:space="preserve">9c765f6</w:t>
-            </w:r>
-            <w:r>
-              <w:t xml:space="preserve">; evidence</w:t>
-            </w:r>
-            <w:r>
-              <w:t xml:space="preserve"> </w:t>
-            </w:r>
-            <w:r>
-              <w:rPr>
-                <w:rStyle w:val="VerbatimChar"/>
-              </w:rPr>
-              <w:t xml:space="preserve">docs/qa/HRD-090-20260529T052228Z/</w:t>
-            </w:r>
-            <w:r>
-              <w:t xml:space="preserve"> </w:t>
-            </w:r>
-            <w:r>
-              <w:t xml:space="preserve">+</w:t>
-            </w:r>
-            <w:r>
-              <w:t xml:space="preserve"> </w:t>
-            </w:r>
-            <w:r>
-              <w:rPr>
-                <w:rStyle w:val="VerbatimChar"/>
-              </w:rPr>
-              <w:t xml:space="preserve">docs/qa/HRD-090-stress-chaos-20260529T054500Z/</w:t>
-            </w:r>
-            <w:r>
-              <w:t xml:space="preserve">. Governance-plane subscriber follow-up = HRD-147 (Issues.md).** Prior r17 atomically lands (§11.4.19) the completed Wave 8 Track B (MTProto user-account harness for §11.4.98 full-automation testing) — HRD-139 (MTProto Client live wiring + qaherald mtproto CLI), HRD-140 (Subscribe roundtrip), HRD-141 (Wave 6 closed loop), HRD-142 (Wave 6.5 lifecycle) all New→Fixed (these HRDs were tracked directly in the TaskList rather than Issues.md and graduate directly into Fixed.md per §11.4.19 the moment closure landed).** Wave 8 Track B closure proves §11.4.98 (full-automation anti-bluff mandate) end-to-end: 3 MTProto-driven live tests (E135 Subscribe / E136 Wave 6 closed loop / E137 Wave 6.5 lifecycle) all PASSING LIVE under §11.4.98-pure interpretation, captured under</w:t>
-            </w:r>
-            <w:r>
-              <w:t xml:space="preserve"> </w:t>
-            </w:r>
-            <w:r>
-              <w:rPr>
-                <w:rStyle w:val="VerbatimChar"/>
-              </w:rPr>
-              <w:t xml:space="preserve">docs/qa/HRD-LIVE-MTPROTO-20260528T125321Z/</w:t>
-            </w:r>
-            <w:r>
-              <w:t xml:space="preserve">. Three legacy NON-COMPLIANT tests graduate to §11.4.90 Obsolete in Issues.md r36 with Obsolete-Details cite of §11.4.98 + §108.m superseding-mandate:</w:t>
-            </w:r>
-            <w:r>
-              <w:t xml:space="preserve"> </w:t>
-            </w:r>
-            <w:r>
-              <w:rPr>
-                <w:rStyle w:val="VerbatimChar"/>
-              </w:rPr>
-              <w:t xml:space="preserve">TestSubscribe_LiveBotAPI</w:t>
-            </w:r>
-            <w:r>
-              <w:t xml:space="preserve">,</w:t>
-            </w:r>
-            <w:r>
-              <w:t xml:space="preserve"> </w:t>
-            </w:r>
-            <w:r>
-              <w:rPr>
-                <w:rStyle w:val="VerbatimChar"/>
-              </w:rPr>
-              <w:t xml:space="preserve">tests/test_wave6_live_loop.sh</w:t>
-            </w:r>
-            <w:r>
-              <w:t xml:space="preserve">, lifecycle</w:t>
-            </w:r>
-            <w:r>
-              <w:t xml:space="preserve"> </w:t>
-            </w:r>
-            <w:r>
-              <w:rPr>
-                <w:rStyle w:val="VerbatimChar"/>
-              </w:rPr>
-              <w:t xml:space="preserve">--manual</w:t>
-            </w:r>
-            <w:r>
-              <w:t xml:space="preserve"> </w:t>
-            </w:r>
-            <w:r>
-              <w:t xml:space="preserve">mode. v0.6.0 tag (</w:t>
-            </w:r>
-            <w:r>
-              <w:rPr>
-                <w:rStyle w:val="VerbatimChar"/>
-              </w:rPr>
-              <w:t xml:space="preserve">844f340</w:t>
-            </w:r>
-            <w:r>
-              <w:t xml:space="preserve"> </w:t>
-            </w:r>
-            <w:r>
-              <w:t xml:space="preserve">annotated) was already cut on</w:t>
-            </w:r>
-            <w:r>
-              <w:t xml:space="preserve"> </w:t>
-            </w:r>
-            <w:r>
-              <w:rPr>
-                <w:rStyle w:val="VerbatimChar"/>
-              </w:rPr>
-              <w:t xml:space="preserve">d843ddf</w:t>
-            </w:r>
-            <w:r>
-              <w:t xml:space="preserve"> </w:t>
-            </w:r>
-            <w:r>
-              <w:t xml:space="preserve">covering Wave 8 Track B closure + the §11.4.98+§11.4.99 anchoring + 9-Helix-submodule §11.4.98+§11.4.99 propagation. Prior r16 atomically migrates (§11.4.19) the completed Tgram-completeness wave — HRD-133/134/135/136/137/138 (all 6 Tgram-completeness HRDs) Issues→Fixed.** Wave A: HRD-135 lifecycle handlers (</w:t>
-            </w:r>
-            <w:r>
-              <w:rPr>
-                <w:rStyle w:val="VerbatimChar"/>
-              </w:rPr>
-              <w:t xml:space="preserve">fe2a7c8</w:t>
-            </w:r>
-            <w:r>
-              <w:t xml:space="preserve"> </w:t>
-            </w:r>
-            <w:r>
-              <w:t xml:space="preserve">— OnEdited / OnMyChatMember / serviceHandler / ErrBotKicked sentinel) + HRD-136 webhook secret_token validator (</w:t>
-            </w:r>
-            <w:r>
-              <w:rPr>
-                <w:rStyle w:val="VerbatimChar"/>
-              </w:rPr>
-              <w:t xml:space="preserve">6d7d543</w:t>
-            </w:r>
-            <w:r>
-              <w:t xml:space="preserve"> </w:t>
-            </w:r>
-            <w:r>
-              <w:t xml:space="preserve">—</w:t>
-            </w:r>
-            <w:r>
-              <w:t xml:space="preserve"> </w:t>
-            </w:r>
-            <w:r>
-              <w:rPr>
-                <w:rStyle w:val="VerbatimChar"/>
-              </w:rPr>
-              <w:t xml:space="preserve">crypto/subtle.ConstantTimeCompare</w:t>
-            </w:r>
-            <w:r>
-              <w:t xml:space="preserve">, 401-no-leak posture) + HRD-138 operator deep-dive guide (</w:t>
-            </w:r>
-            <w:r>
-              <w:rPr>
-                <w:rStyle w:val="VerbatimChar"/>
-              </w:rPr>
-              <w:t xml:space="preserve">ff9b9c0</w:t>
-            </w:r>
-            <w:r>
-              <w:t xml:space="preserve"> </w:t>
-            </w:r>
-            <w:r>
-              <w:t xml:space="preserve">— 810-line</w:t>
-            </w:r>
-            <w:r>
-              <w:t xml:space="preserve"> </w:t>
-            </w:r>
-            <w:r>
-              <w:rPr>
-                <w:rStyle w:val="VerbatimChar"/>
-              </w:rPr>
-              <w:t xml:space="preserve">docs/guides/TELEGRAM.md</w:t>
-            </w:r>
-            <w:r>
-              <w:t xml:space="preserve">, 11 §-sections, 3 siblings). Wave B: HRD-133 token-redaction symmetry (</w:t>
-            </w:r>
-            <w:r>
-              <w:rPr>
-                <w:rStyle w:val="VerbatimChar"/>
-              </w:rPr>
-              <w:t xml:space="preserve">8162d14</w:t>
-            </w:r>
-            <w:r>
-              <w:t xml:space="preserve"> </w:t>
-            </w:r>
-            <w:r>
-              <w:t xml:space="preserve">—</w:t>
-            </w:r>
-            <w:r>
-              <w:t xml:space="preserve"> </w:t>
-            </w:r>
-            <w:r>
-              <w:rPr>
-                <w:rStyle w:val="VerbatimChar"/>
-              </w:rPr>
-              <w:t xml:space="preserve">sanitizeTgramError</w:t>
-            </w:r>
-            <w:r>
-              <w:t xml:space="preserve"> </w:t>
-            </w:r>
-            <w:r>
-              <w:t xml:space="preserve">wraps 6 error-return sites in Send/SendReply) + HRD-134 429 retry_after honored (</w:t>
-            </w:r>
-            <w:r>
-              <w:rPr>
-                <w:rStyle w:val="VerbatimChar"/>
-              </w:rPr>
-              <w:t xml:space="preserve">8162d14</w:t>
-            </w:r>
-            <w:r>
-              <w:t xml:space="preserve"> </w:t>
-            </w:r>
-            <w:r>
-              <w:t xml:space="preserve">combined —</w:t>
-            </w:r>
-            <w:r>
-              <w:t xml:space="preserve"> </w:t>
-            </w:r>
-            <w:r>
-              <w:rPr>
-                <w:rStyle w:val="VerbatimChar"/>
-              </w:rPr>
-              <w:t xml:space="preserve">withRetry429</w:t>
-            </w:r>
-            <w:r>
-              <w:t xml:space="preserve"> </w:t>
-            </w:r>
-            <w:r>
-              <w:t xml:space="preserve">wraps all 3 telebot</w:t>
-            </w:r>
-            <w:r>
-              <w:t xml:space="preserve"> </w:t>
-            </w:r>
-            <w:r>
-              <w:rPr>
-                <w:rStyle w:val="VerbatimChar"/>
-              </w:rPr>
-              <w:t xml:space="preserve">bot.Send</w:t>
-            </w:r>
-            <w:r>
-              <w:t xml:space="preserve"> </w:t>
-            </w:r>
-            <w:r>
-              <w:t xml:space="preserve">sites, telebot.FloodError typed extraction, ctx-aware sleep, 3-attempt 60s-clamp). Wave C: HRD-137 stress+chaos suite (this commit —</w:t>
-            </w:r>
-            <w:r>
-              <w:t xml:space="preserve"> </w:t>
-            </w:r>
-            <w:r>
-              <w:rPr>
-                <w:rStyle w:val="VerbatimChar"/>
-              </w:rPr>
-              <w:t xml:space="preserve">TestTgram_Stress_MultiRecipientFanOut</w:t>
-            </w:r>
-            <w:r>
-              <w:t xml:space="preserve"> </w:t>
-            </w:r>
-            <w:r>
-              <w:t xml:space="preserve">20×20=400 calls/20 chats deterministic +</w:t>
-            </w:r>
-            <w:r>
-              <w:t xml:space="preserve"> </w:t>
-            </w:r>
-            <w:r>
-              <w:rPr>
-                <w:rStyle w:val="VerbatimChar"/>
-              </w:rPr>
-              <w:t xml:space="preserve">TestTgram_Chaos_GetUpdatesPollerResilience</w:t>
-            </w:r>
-            <w:r>
-              <w:t xml:space="preserve"> </w:t>
-            </w:r>
-            <w:r>
-              <w:t xml:space="preserve">SKIP→PASS conversion via one-line</w:t>
-            </w:r>
-            <w:r>
-              <w:t xml:space="preserve"> </w:t>
-            </w:r>
-            <w:r>
-              <w:rPr>
-                <w:rStyle w:val="VerbatimChar"/>
-              </w:rPr>
-              <w:t xml:space="preserve">subscribe.go</w:t>
-            </w:r>
-            <w:r>
-              <w:t xml:space="preserve"> </w:t>
-            </w:r>
-            <w:r>
-              <w:t xml:space="preserve">baseURL seam fix; 8-phase fault matrix deterministic across</w:t>
-            </w:r>
-            <w:r>
-              <w:t xml:space="preserve"> </w:t>
-            </w:r>
-            <w:r>
-              <w:rPr>
-                <w:rStyle w:val="VerbatimChar"/>
-              </w:rPr>
-              <w:t xml:space="preserve">-race -count=3</w:t>
-            </w:r>
-            <w:r>
-              <w:t xml:space="preserve"> </w:t>
-            </w:r>
-            <w:r>
-              <w:t xml:space="preserve">— every iteration IDENTICAL</w:t>
-            </w:r>
-            <w:r>
-              <w:t xml:space="preserve"> </w:t>
-            </w:r>
-            <w:r>
-              <w:rPr>
-                <w:rStyle w:val="VerbatimChar"/>
-              </w:rPr>
-              <w:t xml:space="preserve">recovery=6 fault(500=12 hang=8 close=3 ok=6) goroutines 3→4</w:t>
-            </w:r>
-            <w:r>
-              <w:t xml:space="preserve">). Full tgram suite</w:t>
-            </w:r>
-            <w:r>
-              <w:t xml:space="preserve"> </w:t>
+              <w:t xml:space="preserve">a975d8b</w:t>
             </w:r>
             <w:r>
               <w:rPr>
                 <w:b/>
                 <w:bCs/>
               </w:rPr>
+              <w:t xml:space="preserve">) + HRD-147 (governance dead-letter subscriber +</w:t>
+            </w:r>
+            <w:r>
+              <w:rPr>
+                <w:b/>
+                <w:bCs/>
+              </w:rPr>
+              <w:t xml:space="preserve"> </w:t>
+            </w:r>
+            <w:r>
+              <w:rPr>
+                <w:rStyle w:val="VerbatimChar"/>
+                <w:b/>
+                <w:bCs/>
+              </w:rPr>
+              <w:t xml:space="preserve">DeadLetterSink</w:t>
+            </w:r>
+            <w:r>
+              <w:rPr>
+                <w:b/>
+                <w:bCs/>
+              </w:rPr>
+              <w:t xml:space="preserve"> </w:t>
+            </w:r>
+            <w:r>
+              <w:rPr>
+                <w:b/>
+                <w:bCs/>
+              </w:rPr>
+              <w:t xml:space="preserve">+ real emitter wiring in boot.go,</w:t>
+            </w:r>
+            <w:r>
+              <w:rPr>
+                <w:b/>
+                <w:bCs/>
+              </w:rPr>
+              <w:t xml:space="preserve"> </w:t>
+            </w:r>
+            <w:r>
+              <w:rPr>
+                <w:rStyle w:val="VerbatimChar"/>
+                <w:b/>
+                <w:bCs/>
+              </w:rPr>
+              <w:t xml:space="preserve">9ef4be9</w:t>
+            </w:r>
+            <w:r>
+              <w:rPr>
+                <w:b/>
+                <w:bCs/>
+              </w:rPr>
+              <w:t xml:space="preserve">) Issues→Fixed — both completed this session with</w:t>
+            </w:r>
+            <w:r>
+              <w:rPr>
+                <w:b/>
+                <w:bCs/>
+              </w:rPr>
+              <w:t xml:space="preserve"> </w:t>
+            </w:r>
+            <w:r>
+              <w:rPr>
+                <w:rStyle w:val="VerbatimChar"/>
+                <w:b/>
+                <w:bCs/>
+              </w:rPr>
+              <w:t xml:space="preserve">-race</w:t>
+            </w:r>
+            <w:r>
+              <w:rPr>
+                <w:b/>
+                <w:bCs/>
+              </w:rPr>
+              <w:t xml:space="preserve"> </w:t>
+            </w:r>
+            <w:r>
+              <w:rPr>
+                <w:b/>
+                <w:bCs/>
+              </w:rPr>
+              <w:t xml:space="preserve">tests.</w:t>
+            </w:r>
+            <w:r>
+              <w:t xml:space="preserve"> </w:t>
+            </w:r>
+            <w:r>
+              <w:t xml:space="preserve">Prior</w:t>
+            </w:r>
+            <w:r>
+              <w:t xml:space="preserve"> </w:t>
+            </w:r>
+            <w:r>
+              <w:rPr>
+                <w:b/>
+                <w:bCs/>
+              </w:rPr>
+              <w:t xml:space="preserve">r19 (v1.0.0 closure-migration) atomically lands (§11.4.19) 51 code-verified HRDs Issues→Fixed after a re-verification audit (grep/read the impl + run the test + confirm the matching e2e invariant + confirm the</w:t>
+            </w:r>
+            <w:r>
+              <w:rPr>
+                <w:b/>
+                <w:bCs/>
+              </w:rPr>
+              <w:t xml:space="preserve"> </w:t>
+            </w:r>
+            <w:r>
+              <w:rPr>
+                <w:rStyle w:val="VerbatimChar"/>
+                <w:b/>
+                <w:bCs/>
+              </w:rPr>
+              <w:t xml:space="preserve">docs/qa/&lt;run-id&gt;/</w:t>
+            </w:r>
+            <w:r>
+              <w:rPr>
+                <w:b/>
+                <w:bCs/>
+              </w:rPr>
+              <w:t xml:space="preserve"> </w:t>
+            </w:r>
+            <w:r>
+              <w:rPr>
+                <w:b/>
+                <w:bCs/>
+              </w:rPr>
+              <w:t xml:space="preserve">dir; nothing migrated on self-reported status alone). The 51:</w:t>
+            </w:r>
+            <w:r>
+              <w:t xml:space="preserve"> </w:t>
+            </w:r>
+            <w:r>
+              <w:t xml:space="preserve">the 7 flavor constitution bindings HRD-019..025 (</w:t>
+            </w:r>
+            <w:r>
+              <w:rPr>
+                <w:rStyle w:val="VerbatimChar"/>
+              </w:rPr>
+              <w:t xml:space="preserve">&lt;flavor&gt;/internal/bindings</w:t>
+            </w:r>
+            <w:r>
+              <w:t xml:space="preserve"> </w:t>
+            </w:r>
+            <w:r>
+              <w:t xml:space="preserve">Pipelines; 7/7 bindings test suites PASS</w:t>
+            </w:r>
+            <w:r>
+              <w:t xml:space="preserve"> </w:t>
+            </w:r>
+            <w:r>
+              <w:rPr>
+                <w:rStyle w:val="VerbatimChar"/>
+              </w:rPr>
+              <w:t xml:space="preserve">-race</w:t>
+            </w:r>
+            <w:r>
+              <w:t xml:space="preserve">; e2e E90-E96; per-HRD</w:t>
+            </w:r>
+            <w:r>
+              <w:t xml:space="preserve"> </w:t>
+            </w:r>
+            <w:r>
+              <w:rPr>
+                <w:rStyle w:val="VerbatimChar"/>
+              </w:rPr>
+              <w:t xml:space="preserve">docs/qa/</w:t>
+            </w:r>
+            <w:r>
+              <w:t xml:space="preserve">); the entire §43 command catalogue HRD-029..056 (30 commands wired into Cobra roots via</w:t>
+            </w:r>
+            <w:r>
+              <w:t xml:space="preserve"> </w:t>
+            </w:r>
+            <w:r>
+              <w:rPr>
+                <w:rStyle w:val="VerbatimChar"/>
+              </w:rPr>
+              <w:t xml:space="preserve">registerGitOps</w:t>
+            </w:r>
+            <w:r>
+              <w:t xml:space="preserve">/</w:t>
+            </w:r>
+            <w:r>
+              <w:rPr>
+                <w:rStyle w:val="VerbatimChar"/>
+              </w:rPr>
+              <w:t xml:space="preserve">registerSysOps</w:t>
+            </w:r>
+            <w:r>
+              <w:t xml:space="preserve">/etc., cmd-test suites PASS, e2e E97-E122, per-HRD</w:t>
+            </w:r>
+            <w:r>
+              <w:t xml:space="preserve"> </w:t>
+            </w:r>
+            <w:r>
+              <w:rPr>
+                <w:rStyle w:val="VerbatimChar"/>
+              </w:rPr>
+              <w:t xml:space="preserve">docs/qa/</w:t>
+            </w:r>
+            <w:r>
+              <w:t xml:space="preserve">); the Batch-D</w:t>
+            </w:r>
+            <w:r>
+              <w:t xml:space="preserve"> </w:t>
+            </w:r>
+            <w:r>
+              <w:rPr>
+                <w:rStyle w:val="VerbatimChar"/>
+              </w:rPr>
+              <w:t xml:space="preserve">commons_infra.pgxTaskRepository</w:t>
+            </w:r>
+            <w:r>
+              <w:t xml:space="preserve"> </w:t>
+            </w:r>
+            <w:r>
+              <w:t xml:space="preserve">ops HRD-085..089 (all 15 methods real impls not</w:t>
+            </w:r>
+            <w:r>
+              <w:t xml:space="preserve"> </w:t>
+            </w:r>
+            <w:r>
+              <w:rPr>
+                <w:rStyle w:val="VerbatimChar"/>
+              </w:rPr>
+              <w:t xml:space="preserve">ErrUnsupported</w:t>
+            </w:r>
+            <w:r>
+              <w:t xml:space="preserve">, migration</w:t>
+            </w:r>
+            <w:r>
+              <w:t xml:space="preserve"> </w:t>
+            </w:r>
+            <w:r>
+              <w:rPr>
+                <w:rStyle w:val="VerbatimChar"/>
+              </w:rPr>
+              <w:t xml:space="preserve">000013_task_resource_snapshots</w:t>
+            </w:r>
+            <w:r>
+              <w:t xml:space="preserve">, e2e E123,</w:t>
+            </w:r>
+            <w:r>
+              <w:t xml:space="preserve"> </w:t>
+            </w:r>
+            <w:r>
+              <w:rPr>
+                <w:rStyle w:val="VerbatimChar"/>
+              </w:rPr>
+              <w:t xml:space="preserve">docs/qa/HRD-085-089-*</w:t>
+            </w:r>
+            <w:r>
+              <w:t xml:space="preserve">); Wave 7 HRD-116/118/119/120/121 (qaherald Slack</w:t>
+            </w:r>
+            <w:r>
+              <w:t xml:space="preserve"> </w:t>
+            </w:r>
+            <w:r>
+              <w:rPr>
+                <w:rStyle w:val="VerbatimChar"/>
+              </w:rPr>
+              <w:t xml:space="preserve">MessengerClient</w:t>
+            </w:r>
+            <w:r>
+              <w:t xml:space="preserve"> </w:t>
+            </w:r>
+            <w:r>
+              <w:t xml:space="preserve">+ e2e E124-E131 + paired §1.1 gate</w:t>
+            </w:r>
+            <w:r>
+              <w:t xml:space="preserve"> </w:t>
+            </w:r>
+            <w:r>
+              <w:rPr>
+                <w:rStyle w:val="VerbatimChar"/>
+              </w:rPr>
+              <w:t xml:space="preserve">tests/test_wave7_mutation_meta.sh</w:t>
+            </w:r>
+            <w:r>
+              <w:t xml:space="preserve"> </w:t>
+            </w:r>
+            <w:r>
+              <w:t xml:space="preserve">+ multi-channel §11.4.85 stress/chaos +</w:t>
+            </w:r>
+            <w:r>
+              <w:t xml:space="preserve"> </w:t>
+            </w:r>
+            <w:r>
+              <w:rPr>
+                <w:rStyle w:val="VerbatimChar"/>
+              </w:rPr>
+              <w:t xml:space="preserve">MESSENGER_CHANNELS.md</w:t>
+            </w:r>
+            <w:r>
+              <w:t xml:space="preserve"> </w:t>
+            </w:r>
+            <w:r>
+              <w:t xml:space="preserve">guide; all hermetic tests PASS); ATMOSphere features HRD-148/149/151/152/153/154 (</w:t>
+            </w:r>
+            <w:r>
+              <w:rPr>
+                <w:rStyle w:val="VerbatimChar"/>
+              </w:rPr>
+              <w:t xml:space="preserve">commons_workable</w:t>
+            </w:r>
+            <w:r>
+              <w:t xml:space="preserve">+</w:t>
+            </w:r>
+            <w:r>
+              <w:rPr>
+                <w:rStyle w:val="VerbatimChar"/>
+              </w:rPr>
+              <w:t xml:space="preserve">commons_watch</w:t>
+            </w:r>
+            <w:r>
+              <w:t xml:space="preserve"> </w:t>
+            </w:r>
+            <w:r>
+              <w:t xml:space="preserve">build+test PASS, change→CloudEvent→Runner bridge + inbound action registry +</w:t>
+            </w:r>
+            <w:r>
+              <w:t xml:space="preserve"> </w:t>
+            </w:r>
+            <w:r>
+              <w:rPr>
+                <w:rStyle w:val="VerbatimChar"/>
+              </w:rPr>
+              <w:t xml:space="preserve">pherald watch</w:t>
+            </w:r>
+            <w:r>
+              <w:t xml:space="preserve"> </w:t>
+            </w:r>
+            <w:r>
+              <w:t xml:space="preserve">daemon + quiet-hours resolver, e2e E139</w:t>
+            </w:r>
+            <w:r>
+              <w:t xml:space="preserve"> </w:t>
+            </w:r>
+            <w:r>
+              <w:rPr>
+                <w:rStyle w:val="VerbatimChar"/>
+              </w:rPr>
+              <w:t xml:space="preserve">TestRunWatch_EndToEndOutbound</w:t>
+            </w:r>
+            <w:r>
+              <w:t xml:space="preserve"> </w:t>
+            </w:r>
+            <w:r>
+              <w:t xml:space="preserve">PASS hermetic).</w:t>
+            </w:r>
+            <w:r>
+              <w:t xml:space="preserve"> </w:t>
+            </w:r>
+            <w:r>
+              <w:rPr>
+                <w:b/>
+                <w:bCs/>
+              </w:rPr>
+              <w:t xml:space="preserve">NOT migrated (evidence-gated, left in Issues.md):</w:t>
+            </w:r>
+            <w:r>
+              <w:t xml:space="preserve"> </w:t>
+            </w:r>
+            <w:r>
+              <w:t xml:space="preserve">HRD-115 (Slack channel adapter — operator-gated on LIVE</w:t>
+            </w:r>
+            <w:r>
+              <w:t xml:space="preserve"> </w:t>
+            </w:r>
+            <w:r>
+              <w:rPr>
+                <w:rStyle w:val="VerbatimChar"/>
+              </w:rPr>
+              <w:t xml:space="preserve">docs/qa/HRD-115-LIVE-*/</w:t>
+            </w:r>
+            <w:r>
+              <w:t xml:space="preserve"> </w:t>
+            </w:r>
+            <w:r>
+              <w:t xml:space="preserve">round-trip evidence per §107.x; only hermetic transcript exists, E127 LIVE-Slack SKIP-with-reason — closing now would be a §107 PASS-bluff); HRD-117 (spec V3 doc-only — §106); HRD-131/150/155/156/157/158 (externally gated); HRD-146/147/081/008/015 (not-started/upstream/operator). Prior r18 atomically lands (§11.4.19) HRD-090 dead-letter handling Completed→Fixed —</w:t>
+            </w:r>
+            <w:r>
+              <w:t xml:space="preserve"> </w:t>
+            </w:r>
+            <w:r>
+              <w:rPr>
+                <w:rStyle w:val="VerbatimChar"/>
+              </w:rPr>
+              <w:t xml:space="preserve">commons_infra.pgxTaskRepository.MoveToDeadLetter</w:t>
+            </w:r>
+            <w:r>
+              <w:t xml:space="preserve"> </w:t>
+            </w:r>
+            <w:r>
+              <w:t xml:space="preserve">(was the last Batch-D</w:t>
+            </w:r>
+            <w:r>
+              <w:t xml:space="preserve"> </w:t>
+            </w:r>
+            <w:r>
+              <w:rPr>
+                <w:rStyle w:val="VerbatimChar"/>
+              </w:rPr>
+              <w:t xml:space="preserve">ErrUnsupported</w:t>
+            </w:r>
+            <w:r>
+              <w:t xml:space="preserve"> </w:t>
+            </w:r>
+            <w:r>
+              <w:t xml:space="preserve">stub): migration</w:t>
+            </w:r>
+            <w:r>
+              <w:t xml:space="preserve"> </w:t>
+            </w:r>
+            <w:r>
+              <w:rPr>
+                <w:rStyle w:val="VerbatimChar"/>
+              </w:rPr>
+              <w:t xml:space="preserve">000014_dead_letter_tasks</w:t>
+            </w:r>
+            <w:r>
+              <w:t xml:space="preserve"> </w:t>
+            </w:r>
+            <w:r>
+              <w:t xml:space="preserve">+ tx-atomic JSONB-snapshot move + terminal-mark; new 13th OPERATIONAL constitution event class</w:t>
+            </w:r>
+            <w:r>
+              <w:t xml:space="preserve"> </w:t>
+            </w:r>
+            <w:r>
+              <w:rPr>
+                <w:rStyle w:val="VerbatimChar"/>
+              </w:rPr>
+              <w:t xml:space="preserve">ClassQueueDeadLetter</w:t>
+            </w:r>
+            <w:r>
+              <w:t xml:space="preserve"> </w:t>
+            </w:r>
+            <w:r>
+              <w:t xml:space="preserve">+</w:t>
+            </w:r>
+            <w:r>
+              <w:t xml:space="preserve"> </w:t>
+            </w:r>
+            <w:r>
+              <w:rPr>
+                <w:rStyle w:val="VerbatimChar"/>
+              </w:rPr>
+              <w:t xml:space="preserve">QueueEvent</w:t>
+            </w:r>
+            <w:r>
+              <w:t xml:space="preserve"> </w:t>
+            </w:r>
+            <w:r>
+              <w:t xml:space="preserve">+</w:t>
+            </w:r>
+            <w:r>
+              <w:t xml:space="preserve"> </w:t>
+            </w:r>
+            <w:r>
+              <w:rPr>
+                <w:rStyle w:val="VerbatimChar"/>
+              </w:rPr>
+              <w:t xml:space="preserve">DeadLetter()</w:t>
+            </w:r>
+            <w:r>
+              <w:t xml:space="preserve"> </w:t>
+            </w:r>
+            <w:r>
+              <w:t xml:space="preserve">emit (wired nil-tolerantly; governance §42.2 set unchanged). Four-layer closure: 3 unit + real-PG integration (3 sinks) + §11.4.85 stress/chaos (50 concurrent race-clean, atomic under fault) + paired §1.1 mutation gate (4/0) + e2e E138; commits</w:t>
+            </w:r>
+            <w:r>
+              <w:t xml:space="preserve"> </w:t>
+            </w:r>
+            <w:r>
+              <w:rPr>
+                <w:rStyle w:val="VerbatimChar"/>
+              </w:rPr>
+              <w:t xml:space="preserve">549261d</w:t>
+            </w:r>
+            <w:r>
+              <w:t xml:space="preserve">+</w:t>
+            </w:r>
+            <w:r>
+              <w:rPr>
+                <w:rStyle w:val="VerbatimChar"/>
+              </w:rPr>
+              <w:t xml:space="preserve">9c765f6</w:t>
+            </w:r>
+            <w:r>
+              <w:t xml:space="preserve">; evidence</w:t>
+            </w:r>
+            <w:r>
+              <w:t xml:space="preserve"> </w:t>
+            </w:r>
+            <w:r>
+              <w:rPr>
+                <w:rStyle w:val="VerbatimChar"/>
+              </w:rPr>
+              <w:t xml:space="preserve">docs/qa/HRD-090-20260529T052228Z/</w:t>
+            </w:r>
+            <w:r>
+              <w:t xml:space="preserve"> </w:t>
+            </w:r>
+            <w:r>
+              <w:t xml:space="preserve">+</w:t>
+            </w:r>
+            <w:r>
+              <w:t xml:space="preserve"> </w:t>
+            </w:r>
+            <w:r>
+              <w:rPr>
+                <w:rStyle w:val="VerbatimChar"/>
+              </w:rPr>
+              <w:t xml:space="preserve">docs/qa/HRD-090-stress-chaos-20260529T054500Z/</w:t>
+            </w:r>
+            <w:r>
+              <w:t xml:space="preserve">. Governance-plane subscriber follow-up = HRD-147 (Issues.md).** Prior r17 atomically lands (§11.4.19) the completed Wave 8 Track B (MTProto user-account harness for §11.4.98 full-automation testing) — HRD-139 (MTProto Client live wiring + qaherald mtproto CLI), HRD-140 (Subscribe roundtrip), HRD-141 (Wave 6 closed loop), HRD-142 (Wave 6.5 lifecycle) all New→Fixed (these HRDs were tracked directly in the TaskList rather than Issues.md and graduate directly into Fixed.md per §11.4.19 the moment closure landed).** Wave 8 Track B closure proves §11.4.98 (full-automation anti-bluff mandate) end-to-end: 3 MTProto-driven live tests (E135 Subscribe / E136 Wave 6 closed loop / E137 Wave 6.5 lifecycle) all PASSING LIVE under §11.4.98-pure interpretation, captured under</w:t>
+            </w:r>
+            <w:r>
+              <w:t xml:space="preserve"> </w:t>
+            </w:r>
+            <w:r>
+              <w:rPr>
+                <w:rStyle w:val="VerbatimChar"/>
+              </w:rPr>
+              <w:t xml:space="preserve">docs/qa/HRD-LIVE-MTPROTO-20260528T125321Z/</w:t>
+            </w:r>
+            <w:r>
+              <w:t xml:space="preserve">. Three legacy NON-COMPLIANT tests graduate to §11.4.90 Obsolete in Issues.md r36 with Obsolete-Details cite of §11.4.98 + §108.m superseding-mandate:</w:t>
+            </w:r>
+            <w:r>
+              <w:t xml:space="preserve"> </w:t>
+            </w:r>
+            <w:r>
+              <w:rPr>
+                <w:rStyle w:val="VerbatimChar"/>
+              </w:rPr>
+              <w:t xml:space="preserve">TestSubscribe_LiveBotAPI</w:t>
+            </w:r>
+            <w:r>
+              <w:t xml:space="preserve">,</w:t>
+            </w:r>
+            <w:r>
+              <w:t xml:space="preserve"> </w:t>
+            </w:r>
+            <w:r>
+              <w:rPr>
+                <w:rStyle w:val="VerbatimChar"/>
+              </w:rPr>
+              <w:t xml:space="preserve">tests/test_wave6_live_loop.sh</w:t>
+            </w:r>
+            <w:r>
+              <w:t xml:space="preserve">, lifecycle</w:t>
+            </w:r>
+            <w:r>
+              <w:t xml:space="preserve"> </w:t>
+            </w:r>
+            <w:r>
+              <w:rPr>
+                <w:rStyle w:val="VerbatimChar"/>
+              </w:rPr>
+              <w:t xml:space="preserve">--manual</w:t>
+            </w:r>
+            <w:r>
+              <w:t xml:space="preserve"> </w:t>
+            </w:r>
+            <w:r>
+              <w:t xml:space="preserve">mode. v0.6.0 tag (</w:t>
+            </w:r>
+            <w:r>
+              <w:rPr>
+                <w:rStyle w:val="VerbatimChar"/>
+              </w:rPr>
+              <w:t xml:space="preserve">844f340</w:t>
+            </w:r>
+            <w:r>
+              <w:t xml:space="preserve"> </w:t>
+            </w:r>
+            <w:r>
+              <w:t xml:space="preserve">annotated) was already cut on</w:t>
+            </w:r>
+            <w:r>
+              <w:t xml:space="preserve"> </w:t>
+            </w:r>
+            <w:r>
+              <w:rPr>
+                <w:rStyle w:val="VerbatimChar"/>
+              </w:rPr>
+              <w:t xml:space="preserve">d843ddf</w:t>
+            </w:r>
+            <w:r>
+              <w:t xml:space="preserve"> </w:t>
+            </w:r>
+            <w:r>
+              <w:t xml:space="preserve">covering Wave 8 Track B closure + the §11.4.98+§11.4.99 anchoring + 9-Helix-submodule §11.4.98+§11.4.99 propagation. Prior r16 atomically migrates (§11.4.19) the completed Tgram-completeness wave — HRD-133/134/135/136/137/138 (all 6 Tgram-completeness HRDs) Issues→Fixed.** Wave A: HRD-135 lifecycle handlers (</w:t>
+            </w:r>
+            <w:r>
+              <w:rPr>
+                <w:rStyle w:val="VerbatimChar"/>
+              </w:rPr>
+              <w:t xml:space="preserve">fe2a7c8</w:t>
+            </w:r>
+            <w:r>
+              <w:t xml:space="preserve"> </w:t>
+            </w:r>
+            <w:r>
+              <w:t xml:space="preserve">— OnEdited / OnMyChatMember / serviceHandler / ErrBotKicked sentinel) + HRD-136 webhook secret_token validator (</w:t>
+            </w:r>
+            <w:r>
+              <w:rPr>
+                <w:rStyle w:val="VerbatimChar"/>
+              </w:rPr>
+              <w:t xml:space="preserve">6d7d543</w:t>
+            </w:r>
+            <w:r>
+              <w:t xml:space="preserve"> </w:t>
+            </w:r>
+            <w:r>
+              <w:t xml:space="preserve">—</w:t>
+            </w:r>
+            <w:r>
+              <w:t xml:space="preserve"> </w:t>
+            </w:r>
+            <w:r>
+              <w:rPr>
+                <w:rStyle w:val="VerbatimChar"/>
+              </w:rPr>
+              <w:t xml:space="preserve">crypto/subtle.ConstantTimeCompare</w:t>
+            </w:r>
+            <w:r>
+              <w:t xml:space="preserve">, 401-no-leak posture) + HRD-138 operator deep-dive guide (</w:t>
+            </w:r>
+            <w:r>
+              <w:rPr>
+                <w:rStyle w:val="VerbatimChar"/>
+              </w:rPr>
+              <w:t xml:space="preserve">ff9b9c0</w:t>
+            </w:r>
+            <w:r>
+              <w:t xml:space="preserve"> </w:t>
+            </w:r>
+            <w:r>
+              <w:t xml:space="preserve">— 810-line</w:t>
+            </w:r>
+            <w:r>
+              <w:t xml:space="preserve"> </w:t>
+            </w:r>
+            <w:r>
+              <w:rPr>
+                <w:rStyle w:val="VerbatimChar"/>
+              </w:rPr>
+              <w:t xml:space="preserve">docs/guides/TELEGRAM.md</w:t>
+            </w:r>
+            <w:r>
+              <w:t xml:space="preserve">, 11 §-sections, 3 siblings). Wave B: HRD-133 token-redaction symmetry (</w:t>
+            </w:r>
+            <w:r>
+              <w:rPr>
+                <w:rStyle w:val="VerbatimChar"/>
+              </w:rPr>
+              <w:t xml:space="preserve">8162d14</w:t>
+            </w:r>
+            <w:r>
+              <w:t xml:space="preserve"> </w:t>
+            </w:r>
+            <w:r>
+              <w:t xml:space="preserve">—</w:t>
+            </w:r>
+            <w:r>
+              <w:t xml:space="preserve"> </w:t>
+            </w:r>
+            <w:r>
+              <w:rPr>
+                <w:rStyle w:val="VerbatimChar"/>
+              </w:rPr>
+              <w:t xml:space="preserve">sanitizeTgramError</w:t>
+            </w:r>
+            <w:r>
+              <w:t xml:space="preserve"> </w:t>
+            </w:r>
+            <w:r>
+              <w:t xml:space="preserve">wraps 6 error-return sites in Send/SendReply) + HRD-134 429 retry_after honored (</w:t>
+            </w:r>
+            <w:r>
+              <w:rPr>
+                <w:rStyle w:val="VerbatimChar"/>
+              </w:rPr>
+              <w:t xml:space="preserve">8162d14</w:t>
+            </w:r>
+            <w:r>
+              <w:t xml:space="preserve"> </w:t>
+            </w:r>
+            <w:r>
+              <w:t xml:space="preserve">combined —</w:t>
+            </w:r>
+            <w:r>
+              <w:t xml:space="preserve"> </w:t>
+            </w:r>
+            <w:r>
+              <w:rPr>
+                <w:rStyle w:val="VerbatimChar"/>
+              </w:rPr>
+              <w:t xml:space="preserve">withRetry429</w:t>
+            </w:r>
+            <w:r>
+              <w:t xml:space="preserve"> </w:t>
+            </w:r>
+            <w:r>
+              <w:t xml:space="preserve">wraps all 3 telebot</w:t>
+            </w:r>
+            <w:r>
+              <w:t xml:space="preserve"> </w:t>
+            </w:r>
+            <w:r>
+              <w:rPr>
+                <w:rStyle w:val="VerbatimChar"/>
+              </w:rPr>
+              <w:t xml:space="preserve">bot.Send</w:t>
+            </w:r>
+            <w:r>
+              <w:t xml:space="preserve"> </w:t>
+            </w:r>
+            <w:r>
+              <w:t xml:space="preserve">sites, telebot.FloodError typed extraction, ctx-aware sleep, 3-attempt 60s-clamp). Wave C: HRD-137 stress+chaos suite (this commit —</w:t>
+            </w:r>
+            <w:r>
+              <w:t xml:space="preserve"> </w:t>
+            </w:r>
+            <w:r>
+              <w:rPr>
+                <w:rStyle w:val="VerbatimChar"/>
+              </w:rPr>
+              <w:t xml:space="preserve">TestTgram_Stress_MultiRecipientFanOut</w:t>
+            </w:r>
+            <w:r>
+              <w:t xml:space="preserve"> </w:t>
+            </w:r>
+            <w:r>
+              <w:t xml:space="preserve">20×20=400 calls/20 chats deterministic +</w:t>
+            </w:r>
+            <w:r>
+              <w:t xml:space="preserve"> </w:t>
+            </w:r>
+            <w:r>
+              <w:rPr>
+                <w:rStyle w:val="VerbatimChar"/>
+              </w:rPr>
+              <w:t xml:space="preserve">TestTgram_Chaos_GetUpdatesPollerResilience</w:t>
+            </w:r>
+            <w:r>
+              <w:t xml:space="preserve"> </w:t>
+            </w:r>
+            <w:r>
+              <w:t xml:space="preserve">SKIP→PASS conversion via one-line</w:t>
+            </w:r>
+            <w:r>
+              <w:t xml:space="preserve"> </w:t>
+            </w:r>
+            <w:r>
+              <w:rPr>
+                <w:rStyle w:val="VerbatimChar"/>
+              </w:rPr>
+              <w:t xml:space="preserve">subscribe.go</w:t>
+            </w:r>
+            <w:r>
+              <w:t xml:space="preserve"> </w:t>
+            </w:r>
+            <w:r>
+              <w:t xml:space="preserve">baseURL seam fix; 8-phase fault matrix deterministic across</w:t>
+            </w:r>
+            <w:r>
+              <w:t xml:space="preserve"> </w:t>
+            </w:r>
+            <w:r>
+              <w:rPr>
+                <w:rStyle w:val="VerbatimChar"/>
+              </w:rPr>
+              <w:t xml:space="preserve">-race -count=3</w:t>
+            </w:r>
+            <w:r>
+              <w:t xml:space="preserve"> </w:t>
+            </w:r>
+            <w:r>
+              <w:t xml:space="preserve">— every iteration IDENTICAL</w:t>
+            </w:r>
+            <w:r>
+              <w:t xml:space="preserve"> </w:t>
+            </w:r>
+            <w:r>
+              <w:rPr>
+                <w:rStyle w:val="VerbatimChar"/>
+              </w:rPr>
+              <w:t xml:space="preserve">recovery=6 fault(500=12 hang=8 close=3 ok=6) goroutines 3→4</w:t>
+            </w:r>
+            <w:r>
+              <w:t xml:space="preserve">). Full tgram suite</w:t>
+            </w:r>
+            <w:r>
+              <w:t xml:space="preserve"> </w:t>
+            </w:r>
+            <w:r>
+              <w:rPr>
+                <w:b/>
+                <w:bCs/>
+              </w:rPr>
               <w:t xml:space="preserve">26/26 PASS, 0 SKIP</w:t>
             </w:r>
             <w:r>
@@ -1487,7 +1627,7 @@
               <w:pStyle w:val="Compact"/>
             </w:pPr>
             <w:r>
-              <w:t xml:space="preserve">HRD-001..HRD-007, HRD-009, HRD-009b, HRD-010, HRD-011, HRD-012, HRD-013, HRD-014, HRD-016, HRD-017, HRD-018, HRD-019..HRD-025, HRD-026, HRD-027, HRD-028, HRD-029..HRD-056, HRD-080, HRD-085..HRD-089, HRD-090, HRD-092, HRD-093, HRD-094, HRD-095, HRD-096, HRD-097, HRD-098, HRD-099, HRD-100, HRD-110, HRD-111, HRD-112, HRD-113, HRD-114, HRD-116, HRD-118, HRD-119, HRD-120, HRD-121, HRD-122, HRD-123, HRD-124, HRD-125, HRD-126, HRD-127, HRD-128, HRD-129, HRD-130, HRD-132, HRD-133, HRD-134, HRD-135, HRD-136, HRD-137, HRD-138, HRD-139, HRD-140, HRD-141, HRD-142, HRD-148, HRD-149, HRD-151, HRD-152, HRD-153, HRD-154</w:t>
+              <w:t xml:space="preserve">HRD-001..HRD-007, HRD-009, HRD-009b, HRD-010, HRD-011, HRD-012, HRD-013, HRD-014, HRD-016, HRD-017, HRD-018, HRD-019..HRD-025, HRD-026, HRD-027, HRD-028, HRD-029..HRD-056, HRD-080, HRD-085..HRD-089, HRD-090, HRD-092, HRD-093, HRD-094, HRD-095, HRD-096, HRD-097, HRD-098, HRD-099, HRD-100, HRD-110, HRD-111, HRD-112, HRD-113, HRD-114, HRD-116, HRD-118, HRD-119, HRD-120, HRD-121, HRD-122, HRD-123, HRD-124, HRD-125, HRD-126, HRD-127, HRD-128, HRD-129, HRD-130, HRD-132, HRD-133, HRD-134, HRD-135, HRD-136, HRD-137, HRD-138, HRD-139, HRD-140, HRD-141, HRD-142, HRD-146, HRD-147, HRD-148, HRD-149, HRD-151, HRD-152, HRD-153, HRD-154</w:t>
             </w:r>
           </w:p>
         </w:tc>
@@ -1724,6 +1864,575 @@
             </w:pPr>
             <w:r>
               <w:t xml:space="preserve">Reference</w:t>
+            </w:r>
+          </w:p>
+        </w:tc>
+      </w:tr>
+      <w:tr>
+        <w:tc>
+          <w:tcPr/>
+          <w:p>
+            <w:pPr>
+              <w:pStyle w:val="Compact"/>
+            </w:pPr>
+            <w:r>
+              <w:t xml:space="preserve">HRD-147</w:t>
+            </w:r>
+          </w:p>
+        </w:tc>
+        <w:tc>
+          <w:tcPr/>
+          <w:p>
+            <w:pPr>
+              <w:pStyle w:val="Compact"/>
+            </w:pPr>
+            <w:r>
+              <w:t xml:space="preserve">task</w:t>
+            </w:r>
+          </w:p>
+        </w:tc>
+        <w:tc>
+          <w:tcPr/>
+          <w:p>
+            <w:pPr>
+              <w:pStyle w:val="Compact"/>
+            </w:pPr>
+            <w:r>
+              <w:t xml:space="preserve">low</w:t>
+            </w:r>
+          </w:p>
+        </w:tc>
+        <w:tc>
+          <w:tcPr/>
+          <w:p>
+            <w:pPr>
+              <w:pStyle w:val="Compact"/>
+            </w:pPr>
+            <w:r>
+              <w:t xml:space="preserve">Governance-plane dead-letter subscriber — durable consumer draining</w:t>
+            </w:r>
+            <w:r>
+              <w:t xml:space="preserve"> </w:t>
+            </w:r>
+            <w:r>
+              <w:rPr>
+                <w:rStyle w:val="VerbatimChar"/>
+              </w:rPr>
+              <w:t xml:space="preserve">.queue.dead_letter</w:t>
+            </w:r>
+            <w:r>
+              <w:t xml:space="preserve"> </w:t>
+            </w:r>
+            <w:r>
+              <w:t xml:space="preserve">events into a</w:t>
+            </w:r>
+            <w:r>
+              <w:t xml:space="preserve"> </w:t>
+            </w:r>
+            <w:r>
+              <w:rPr>
+                <w:rStyle w:val="VerbatimChar"/>
+              </w:rPr>
+              <w:t xml:space="preserve">DeadLetterSink</w:t>
+            </w:r>
+            <w:r>
+              <w:t xml:space="preserve"> </w:t>
+            </w:r>
+            <w:r>
+              <w:t xml:space="preserve">(</w:t>
+            </w:r>
+            <w:r>
+              <w:rPr>
+                <w:rStyle w:val="VerbatimChar"/>
+              </w:rPr>
+              <w:t xml:space="preserve">MemoryDeadLetterSink</w:t>
+            </w:r>
+            <w:r>
+              <w:t xml:space="preserve"> </w:t>
+            </w:r>
+            <w:r>
+              <w:t xml:space="preserve">M1; a</w:t>
+            </w:r>
+            <w:r>
+              <w:t xml:space="preserve"> </w:t>
+            </w:r>
+            <w:r>
+              <w:rPr>
+                <w:rStyle w:val="VerbatimChar"/>
+              </w:rPr>
+              <w:t xml:space="preserve">PostgresDeadLetterSink</w:t>
+            </w:r>
+            <w:r>
+              <w:t xml:space="preserve"> </w:t>
+            </w:r>
+            <w:r>
+              <w:t xml:space="preserve">is a drop-in behind the interface).</w:t>
+            </w:r>
+            <w:r>
+              <w:t xml:space="preserve"> </w:t>
+            </w:r>
+            <w:r>
+              <w:rPr>
+                <w:rStyle w:val="VerbatimChar"/>
+              </w:rPr>
+              <w:t xml:space="preserve">commons_infra/boot.go</w:t>
+            </w:r>
+            <w:r>
+              <w:t xml:space="preserve"> </w:t>
+            </w:r>
+            <w:r>
+              <w:t xml:space="preserve">now wires the REAL emitter into</w:t>
+            </w:r>
+            <w:r>
+              <w:t xml:space="preserve"> </w:t>
+            </w:r>
+            <w:r>
+              <w:rPr>
+                <w:rStyle w:val="VerbatimChar"/>
+              </w:rPr>
+              <w:t xml:space="preserve">newPgxTaskRepositoryWithEmitter</w:t>
+            </w:r>
+            <w:r>
+              <w:t xml:space="preserve"> </w:t>
+            </w:r>
+            <w:r>
+              <w:t xml:space="preserve">(was the nil-emitter) + stands up a</w:t>
+            </w:r>
+            <w:r>
+              <w:t xml:space="preserve"> </w:t>
+            </w:r>
+            <w:r>
+              <w:rPr>
+                <w:rStyle w:val="VerbatimChar"/>
+              </w:rPr>
+              <w:t xml:space="preserve">DeadLetterSubscriber</w:t>
+            </w:r>
+            <w:r>
+              <w:t xml:space="preserve"> </w:t>
+            </w:r>
+            <w:r>
+              <w:t xml:space="preserve">drain goroutine (Close-able, decode-error-counted), guarded to build only alongside the Postgres pool and to fall back to the nil-emitter if emitter construction fails (a dead-letter move must never fail because the audit bus is down). Mirrors the</w:t>
+            </w:r>
+            <w:r>
+              <w:t xml:space="preserve"> </w:t>
+            </w:r>
+            <w:r>
+              <w:rPr>
+                <w:rStyle w:val="VerbatimChar"/>
+              </w:rPr>
+              <w:t xml:space="preserve">commons_constitution.AuditStore</w:t>
+            </w:r>
+            <w:r>
+              <w:t xml:space="preserve"> </w:t>
+            </w:r>
+            <w:r>
+              <w:t xml:space="preserve">append-only pattern (§11.4.74). 8 new tests (move→emit→subscribe→sink end-to-end, failure-count propagation, 50-concurrent</w:t>
+            </w:r>
+            <w:r>
+              <w:t xml:space="preserve"> </w:t>
+            </w:r>
+            <w:r>
+              <w:rPr>
+                <w:rStyle w:val="VerbatimChar"/>
+              </w:rPr>
+              <w:t xml:space="preserve">-race</w:t>
+            </w:r>
+            <w:r>
+              <w:t xml:space="preserve">, idempotent Close) + the 3 existing MoveToDeadLetter tests PASS. M2</w:t>
+            </w:r>
+            <w:r>
+              <w:t xml:space="preserve"> </w:t>
+            </w:r>
+            <w:r>
+              <w:rPr>
+                <w:rStyle w:val="VerbatimChar"/>
+              </w:rPr>
+              <w:t xml:space="preserve">PostgresDeadLetterSink</w:t>
+            </w:r>
+            <w:r>
+              <w:t xml:space="preserve"> </w:t>
+            </w:r>
+            <w:r>
+              <w:t xml:space="preserve">behind the interface is the documented follow-up.</w:t>
+            </w:r>
+          </w:p>
+        </w:tc>
+        <w:tc>
+          <w:tcPr/>
+          <w:p>
+            <w:pPr>
+              <w:pStyle w:val="Compact"/>
+            </w:pPr>
+            <w:r>
+              <w:t xml:space="preserve">2026-05-30</w:t>
+            </w:r>
+          </w:p>
+        </w:tc>
+        <w:tc>
+          <w:tcPr/>
+          <w:p>
+            <w:pPr>
+              <w:pStyle w:val="Compact"/>
+            </w:pPr>
+            <w:r>
+              <w:rPr>
+                <w:rStyle w:val="VerbatimChar"/>
+              </w:rPr>
+              <w:t xml:space="preserve">9ef4be9</w:t>
+            </w:r>
+          </w:p>
+        </w:tc>
+        <w:tc>
+          <w:tcPr/>
+          <w:p>
+            <w:pPr>
+              <w:pStyle w:val="Compact"/>
+            </w:pPr>
+            <w:r>
+              <w:t xml:space="preserve">follow-up from HRD-090 (Fixed); spec V3 §42.1 + §44; source</w:t>
+            </w:r>
+            <w:r>
+              <w:t xml:space="preserve"> </w:t>
+            </w:r>
+            <w:r>
+              <w:rPr>
+                <w:rStyle w:val="VerbatimChar"/>
+              </w:rPr>
+              <w:t xml:space="preserve">commons_infra/dead_letter_subscriber.go</w:t>
+            </w:r>
+            <w:r>
+              <w:t xml:space="preserve"> </w:t>
+            </w:r>
+            <w:r>
+              <w:t xml:space="preserve">+</w:t>
+            </w:r>
+            <w:r>
+              <w:t xml:space="preserve"> </w:t>
+            </w:r>
+            <w:r>
+              <w:rPr>
+                <w:rStyle w:val="VerbatimChar"/>
+              </w:rPr>
+              <w:t xml:space="preserve">boot.go</w:t>
+            </w:r>
+            <w:r>
+              <w:t xml:space="preserve">.</w:t>
+            </w:r>
+          </w:p>
+        </w:tc>
+      </w:tr>
+      <w:tr>
+        <w:tc>
+          <w:tcPr/>
+          <w:p>
+            <w:pPr>
+              <w:pStyle w:val="Compact"/>
+            </w:pPr>
+            <w:r>
+              <w:t xml:space="preserve">HRD-146</w:t>
+            </w:r>
+          </w:p>
+        </w:tc>
+        <w:tc>
+          <w:tcPr/>
+          <w:p>
+            <w:pPr>
+              <w:pStyle w:val="Compact"/>
+            </w:pPr>
+            <w:r>
+              <w:t xml:space="preserve">task</w:t>
+            </w:r>
+          </w:p>
+        </w:tc>
+        <w:tc>
+          <w:tcPr/>
+          <w:p>
+            <w:pPr>
+              <w:pStyle w:val="Compact"/>
+            </w:pPr>
+            <w:r>
+              <w:t xml:space="preserve">middle</w:t>
+            </w:r>
+          </w:p>
+        </w:tc>
+        <w:tc>
+          <w:tcPr/>
+          <w:p>
+            <w:pPr>
+              <w:pStyle w:val="Compact"/>
+            </w:pPr>
+            <w:r>
+              <w:rPr>
+                <w:rStyle w:val="VerbatimChar"/>
+              </w:rPr>
+              <w:t xml:space="preserve">pherald listen</w:t>
+            </w:r>
+            <w:r>
+              <w:t xml:space="preserve"> </w:t>
+            </w:r>
+            <w:r>
+              <w:t xml:space="preserve">dispatch hardening — bounded per-message resource use in the inbound→</w:t>
+            </w:r>
+            <w:r>
+              <w:rPr>
+                <w:rStyle w:val="VerbatimChar"/>
+              </w:rPr>
+              <w:t xml:space="preserve">claude_code.Dispatch</w:t>
+            </w:r>
+            <w:r>
+              <w:t xml:space="preserve"> </w:t>
+            </w:r>
+            <w:r>
+              <w:t xml:space="preserve">path. The production path threaded an UNBOUNDED ctx (</w:t>
+            </w:r>
+            <w:r>
+              <w:rPr>
+                <w:rStyle w:val="VerbatimChar"/>
+              </w:rPr>
+              <w:t xml:space="preserve">pherald listen</w:t>
+            </w:r>
+            <w:r>
+              <w:t xml:space="preserve"> </w:t>
+            </w:r>
+            <w:r>
+              <w:t xml:space="preserve">gctx → subscriber goroutine →</w:t>
+            </w:r>
+            <w:r>
+              <w:t xml:space="preserve"> </w:t>
+            </w:r>
+            <w:r>
+              <w:rPr>
+                <w:rStyle w:val="VerbatimChar"/>
+              </w:rPr>
+              <w:t xml:space="preserve">cmd.Output()</w:t>
+            </w:r>
+            <w:r>
+              <w:t xml:space="preserve">), so a hung</w:t>
+            </w:r>
+            <w:r>
+              <w:t xml:space="preserve"> </w:t>
+            </w:r>
+            <w:r>
+              <w:rPr>
+                <w:rStyle w:val="VerbatimChar"/>
+              </w:rPr>
+              <w:t xml:space="preserve">claude</w:t>
+            </w:r>
+            <w:r>
+              <w:t xml:space="preserve"> </w:t>
+            </w:r>
+            <w:r>
+              <w:t xml:space="preserve">child could block the subscriber indefinitely (HRD-146 confirmed reachable, not redundant). Added</w:t>
+            </w:r>
+            <w:r>
+              <w:t xml:space="preserve"> </w:t>
+            </w:r>
+            <w:r>
+              <w:rPr>
+                <w:rStyle w:val="VerbatimChar"/>
+              </w:rPr>
+              <w:t xml:space="preserve">DefaultDispatchTimeout=120s</w:t>
+            </w:r>
+            <w:r>
+              <w:t xml:space="preserve"> </w:t>
+            </w:r>
+            <w:r>
+              <w:t xml:space="preserve">+</w:t>
+            </w:r>
+            <w:r>
+              <w:t xml:space="preserve"> </w:t>
+            </w:r>
+            <w:r>
+              <w:rPr>
+                <w:rStyle w:val="VerbatimChar"/>
+              </w:rPr>
+              <w:t xml:space="preserve">HERALD_CLAUDE_DISPATCH_TIMEOUT</w:t>
+            </w:r>
+            <w:r>
+              <w:t xml:space="preserve"> </w:t>
+            </w:r>
+            <w:r>
+              <w:t xml:space="preserve">env knob +</w:t>
+            </w:r>
+            <w:r>
+              <w:t xml:space="preserve"> </w:t>
+            </w:r>
+            <w:r>
+              <w:rPr>
+                <w:rStyle w:val="VerbatimChar"/>
+              </w:rPr>
+              <w:t xml:space="preserve">SetDispatchTimeout()</w:t>
+            </w:r>
+            <w:r>
+              <w:t xml:space="preserve">;</w:t>
+            </w:r>
+            <w:r>
+              <w:t xml:space="preserve"> </w:t>
+            </w:r>
+            <w:r>
+              <w:rPr>
+                <w:rStyle w:val="VerbatimChar"/>
+              </w:rPr>
+              <w:t xml:space="preserve">Dispatch</w:t>
+            </w:r>
+            <w:r>
+              <w:t xml:space="preserve"> </w:t>
+            </w:r>
+            <w:r>
+              <w:t xml:space="preserve">wraps the caller ctx in</w:t>
+            </w:r>
+            <w:r>
+              <w:t xml:space="preserve"> </w:t>
+            </w:r>
+            <w:r>
+              <w:rPr>
+                <w:rStyle w:val="VerbatimChar"/>
+              </w:rPr>
+              <w:t xml:space="preserve">min(caller-deadline, budget)</w:t>
+            </w:r>
+            <w:r>
+              <w:t xml:space="preserve"> </w:t>
+            </w:r>
+            <w:r>
+              <w:t xml:space="preserve">(a tighter caller still wins; cancellation is not swallowed);</w:t>
+            </w:r>
+            <w:r>
+              <w:t xml:space="preserve"> </w:t>
+            </w:r>
+            <w:r>
+              <w:rPr>
+                <w:rStyle w:val="VerbatimChar"/>
+              </w:rPr>
+              <w:t xml:space="preserve">setProcessGroup</w:t>
+            </w:r>
+            <w:r>
+              <w:t xml:space="preserve"> </w:t>
+            </w:r>
+            <w:r>
+              <w:t xml:space="preserve">(Setpgid +</w:t>
+            </w:r>
+            <w:r>
+              <w:t xml:space="preserve"> </w:t>
+            </w:r>
+            <w:r>
+              <w:rPr>
+                <w:rStyle w:val="VerbatimChar"/>
+              </w:rPr>
+              <w:t xml:space="preserve">Cmd.Cancel</w:t>
+            </w:r>
+            <w:r>
+              <w:t xml:space="preserve">→</w:t>
+            </w:r>
+            <w:r>
+              <w:rPr>
+                <w:rStyle w:val="VerbatimChar"/>
+              </w:rPr>
+              <w:t xml:space="preserve">kill(-pgid)</w:t>
+            </w:r>
+            <w:r>
+              <w:t xml:space="preserve"> </w:t>
+            </w:r>
+            <w:r>
+              <w:t xml:space="preserve">+ WaitDelay) so a pipe-holding child can't wedge</w:t>
+            </w:r>
+            <w:r>
+              <w:t xml:space="preserve"> </w:t>
+            </w:r>
+            <w:r>
+              <w:rPr>
+                <w:rStyle w:val="VerbatimChar"/>
+              </w:rPr>
+              <w:t xml:space="preserve">Output()</w:t>
+            </w:r>
+            <w:r>
+              <w:t xml:space="preserve"> </w:t>
+            </w:r>
+            <w:r>
+              <w:t xml:space="preserve">past the deadline. §11.4.85 evidence: a real</w:t>
+            </w:r>
+            <w:r>
+              <w:t xml:space="preserve"> </w:t>
+            </w:r>
+            <w:r>
+              <w:rPr>
+                <w:rStyle w:val="VerbatimChar"/>
+              </w:rPr>
+              <w:t xml:space="preserve">exec sleep 30</w:t>
+            </w:r>
+            <w:r>
+              <w:t xml:space="preserve"> </w:t>
+            </w:r>
+            <w:r>
+              <w:t xml:space="preserve">shim is KILLED in 702ms (vs 30s) with the timeout-named error; caller-cancel returns in 402ms; happy-path 26ms.</w:t>
+            </w:r>
+            <w:r>
+              <w:t xml:space="preserve"> </w:t>
+            </w:r>
+            <w:r>
+              <w:rPr>
+                <w:rStyle w:val="VerbatimChar"/>
+              </w:rPr>
+              <w:t xml:space="preserve">-race -count=3</w:t>
+            </w:r>
+            <w:r>
+              <w:t xml:space="preserve"> </w:t>
+            </w:r>
+            <w:r>
+              <w:t xml:space="preserve">green.</w:t>
+            </w:r>
+          </w:p>
+        </w:tc>
+        <w:tc>
+          <w:tcPr/>
+          <w:p>
+            <w:pPr>
+              <w:pStyle w:val="Compact"/>
+            </w:pPr>
+            <w:r>
+              <w:t xml:space="preserve">2026-05-30</w:t>
+            </w:r>
+          </w:p>
+        </w:tc>
+        <w:tc>
+          <w:tcPr/>
+          <w:p>
+            <w:pPr>
+              <w:pStyle w:val="Compact"/>
+            </w:pPr>
+            <w:r>
+              <w:rPr>
+                <w:rStyle w:val="VerbatimChar"/>
+              </w:rPr>
+              <w:t xml:space="preserve">a975d8b</w:t>
+            </w:r>
+          </w:p>
+        </w:tc>
+        <w:tc>
+          <w:tcPr/>
+          <w:p>
+            <w:pPr>
+              <w:pStyle w:val="Compact"/>
+            </w:pPr>
+            <w:r>
+              <w:rPr>
+                <w:rStyle w:val="VerbatimChar"/>
+              </w:rPr>
+              <w:t xml:space="preserve">docs/research/oom-investigation-2026-05-29.md</w:t>
+            </w:r>
+            <w:r>
+              <w:t xml:space="preserve">; source</w:t>
+            </w:r>
+            <w:r>
+              <w:t xml:space="preserve"> </w:t>
+            </w:r>
+            <w:r>
+              <w:rPr>
+                <w:rStyle w:val="VerbatimChar"/>
+              </w:rPr>
+              <w:t xml:space="preserve">commons_messaging/dispatch/claude_code/{dispatch,claude_code,bootstrap,procgroup_unix,procgroup_other}.go</w:t>
+            </w:r>
+            <w:r>
+              <w:t xml:space="preserve">.</w:t>
             </w:r>
           </w:p>
         </w:tc>

</xml_diff>

<commit_message>
docs(§11.4.19): close HRD-117 (Wave 7 T8 spec-doc) Issues→Fixed — deliverable verified present in V4
HRD-117's deliverable (§11.0 channels.Channel inbound-runtime extension note + §32.2 Telegram/Slack LIVE + §43 multi-channel pherald listen row) is VERIFIED PRESENT in the active spec V4: §11.0 line 1548 'Wave 7 inbound-runtime extension (channels.Channel)' + Channel.Subscribe (1288-1292) + §32.2 LIVE marks + §43 row. Doc-only task (no product code — the Wave 7 framework/Slack adapter/qaherald client shipped under HRD-116/118/119/120/121, already Fixed). Migrated via cell-count-verified script (Issues HRD-117 rows 0, Fixed 1 row @ 10 pipes, neighbors intact, open 10→9). Issues r47→48, Fixed r22→23, siblings regenerated.

Co-Authored-By: Claude Opus 4.8 <noreply@anthropic.com>
</commit_message>
<xml_diff>
--- a/docs/Fixed.docx
+++ b/docs/Fixed.docx
@@ -75,7 +75,7 @@
               <w:pStyle w:val="Compact"/>
             </w:pPr>
             <w:r>
-              <w:t xml:space="preserve">22</w:t>
+              <w:t xml:space="preserve">23</w:t>
             </w:r>
           </w:p>
         </w:tc>
@@ -171,7 +171,7 @@
               <w:pStyle w:val="Compact"/>
             </w:pPr>
             <w:r>
-              <w:t xml:space="preserve">**r22: §11.4.90 + §11.4.19 atomic Obsolete→Fixed migration — received the 4</w:t>
+              <w:t xml:space="preserve">**r23: §11.4.19 received HRD-117 (Wave 7 T8 spec-doc) from Issues.md — closed because its deliverable is verified present in active spec V4 (§11.0/§32.2/§43; doc-only, product code already Fixed under HRD-116/118/119/120/121). Inserted after the HRD-116 Wave-7 cluster row. Prior r22: §11.4.90 + §11.4.19 atomic Obsolete→Fixed migration — received the 4</w:t>
             </w:r>
             <w:r>
               <w:t xml:space="preserve"> </w:t>
@@ -9762,6 +9762,173 @@
             </w:r>
             <w:r>
               <w:t xml:space="preserve">; Catalogue-Check: reuse Slack Web API endpoints via raw HTTP (NOT slack-go SDK — different layer from HRD-115; offset bookkeeping is qaherald-controlled; 2026-05-28).</w:t>
+            </w:r>
+          </w:p>
+        </w:tc>
+      </w:tr>
+      <w:tr>
+        <w:tc>
+          <w:tcPr/>
+          <w:p>
+            <w:pPr>
+              <w:pStyle w:val="Compact"/>
+            </w:pPr>
+            <w:r>
+              <w:t xml:space="preserve">HRD-117</w:t>
+            </w:r>
+          </w:p>
+        </w:tc>
+        <w:tc>
+          <w:tcPr/>
+          <w:p>
+            <w:pPr>
+              <w:pStyle w:val="Compact"/>
+            </w:pPr>
+            <w:r>
+              <w:t xml:space="preserve">task</w:t>
+            </w:r>
+          </w:p>
+        </w:tc>
+        <w:tc>
+          <w:tcPr/>
+          <w:p>
+            <w:pPr>
+              <w:pStyle w:val="Compact"/>
+            </w:pPr>
+            <w:r>
+              <w:t xml:space="preserve">low</w:t>
+            </w:r>
+          </w:p>
+        </w:tc>
+        <w:tc>
+          <w:tcPr/>
+          <w:p>
+            <w:pPr>
+              <w:pStyle w:val="Compact"/>
+            </w:pPr>
+            <w:r>
+              <w:t xml:space="preserve">Claude</w:t>
+            </w:r>
+          </w:p>
+        </w:tc>
+        <w:tc>
+          <w:tcPr/>
+          <w:p>
+            <w:pPr>
+              <w:pStyle w:val="Compact"/>
+            </w:pPr>
+            <w:r>
+              <w:t xml:space="preserve">@milos85vasic</w:t>
+            </w:r>
+          </w:p>
+        </w:tc>
+        <w:tc>
+          <w:tcPr/>
+          <w:p>
+            <w:pPr>
+              <w:pStyle w:val="Compact"/>
+            </w:pPr>
+            <w:r>
+              <w:t xml:space="preserve">Wave 7 T8 — spec V3 r12→r13: §11.0</w:t>
+            </w:r>
+            <w:r>
+              <w:t xml:space="preserve"> </w:t>
+            </w:r>
+            <w:r>
+              <w:rPr>
+                <w:rStyle w:val="VerbatimChar"/>
+              </w:rPr>
+              <w:t xml:space="preserve">channels.Channel</w:t>
+            </w:r>
+            <w:r>
+              <w:t xml:space="preserve"> </w:t>
+            </w:r>
+            <w:r>
+              <w:t xml:space="preserve">inbound-runtime extension note + §32.2 Telegram/Slack marked LIVE + §43 multi-channel</w:t>
+            </w:r>
+            <w:r>
+              <w:t xml:space="preserve"> </w:t>
+            </w:r>
+            <w:r>
+              <w:rPr>
+                <w:rStyle w:val="VerbatimChar"/>
+              </w:rPr>
+              <w:t xml:space="preserve">pherald listen</w:t>
+            </w:r>
+            <w:r>
+              <w:t xml:space="preserve"> </w:t>
+            </w:r>
+            <w:r>
+              <w:t xml:space="preserve">row. Documents the Wave 7 framework + Slack adapter (T6) + qaherald Slack client (T7) shipped reality — spec catches up to shipped code (no new product code in T8).</w:t>
+            </w:r>
+          </w:p>
+        </w:tc>
+        <w:tc>
+          <w:tcPr/>
+          <w:p>
+            <w:pPr>
+              <w:pStyle w:val="Compact"/>
+            </w:pPr>
+            <w:r>
+              <w:t xml:space="preserve">2026-05-31</w:t>
+            </w:r>
+          </w:p>
+        </w:tc>
+        <w:tc>
+          <w:tcPr/>
+          <w:p>
+            <w:pPr>
+              <w:pStyle w:val="Compact"/>
+            </w:pPr>
+            <w:r>
+              <w:rPr>
+                <w:rStyle w:val="VerbatimChar"/>
+              </w:rPr>
+              <w:t xml:space="preserve">d5107af</w:t>
+            </w:r>
+            <w:r>
+              <w:t xml:space="preserve"> </w:t>
+            </w:r>
+            <w:r>
+              <w:t xml:space="preserve">(carried into spec V4)</w:t>
+            </w:r>
+          </w:p>
+        </w:tc>
+        <w:tc>
+          <w:tcPr/>
+          <w:p>
+            <w:pPr>
+              <w:pStyle w:val="Compact"/>
+            </w:pPr>
+            <w:r>
+              <w:t xml:space="preserve">CLOSED 2026-05-31: deliverable VERIFIED PRESENT in active spec V4 §11.0 (line 1548 "Wave 7 inbound-runtime extension" note +</w:t>
+            </w:r>
+            <w:r>
+              <w:t xml:space="preserve"> </w:t>
+            </w:r>
+            <w:r>
+              <w:rPr>
+                <w:rStyle w:val="VerbatimChar"/>
+              </w:rPr>
+              <w:t xml:space="preserve">Channel.Subscribe</w:t>
+            </w:r>
+            <w:r>
+              <w:t xml:space="preserve">) + §32.2 Telegram/Slack LIVE + §43 multi-channel</w:t>
+            </w:r>
+            <w:r>
+              <w:t xml:space="preserve"> </w:t>
+            </w:r>
+            <w:r>
+              <w:rPr>
+                <w:rStyle w:val="VerbatimChar"/>
+              </w:rPr>
+              <w:t xml:space="preserve">pherald listen</w:t>
+            </w:r>
+            <w:r>
+              <w:t xml:space="preserve"> </w:t>
+            </w:r>
+            <w:r>
+              <w:t xml:space="preserve">row; Wave-7 product code shipped under HRD-116/118/119/120/121 (Fixed). spec V3 r13 §11.0/§32.2/§43; docs/superpowers/plans/2026-05-27-wave7-generic-messenger.md §T8; Catalogue-Check: n/a (doc-only).</w:t>
             </w:r>
           </w:p>
         </w:tc>

</xml_diff>

<commit_message>
docs(trackers): §11.4.19 migrate HRD-115 + HRD-081 Issues->Fixed; annotate HRD-159 (open 10->8)
- HRD-115 (Slack channel adapter) — live round-trip proven (send+inbound+reply
  +threading on a real workspace); participant-handle resolution landed 7e7a04e.
- HRD-081 (podman-compose detection) — fix landed upstream containers 222fb90,
  Herald pointer af48c97; live-proven podman-compose 1.5.0/podman 5.8.2;
  §107.x evidence docs/qa/HRD-081-20260602/evidence.md.
- HRD-159 stays OPEN, annotated: seeding fix (f0c7858) landed, only real-Claude
  live confirmation remains.
- Issues r48->r49, Fixed r23->r24, counts reconciled (| Issues | line fixed:
  it had stale 081/115 and was missing 159); HTML/PDF/DOCX siblings regenerated.

Co-Authored-By: Claude Opus 4.8 <noreply@anthropic.com>
</commit_message>
<xml_diff>
--- a/docs/Fixed.docx
+++ b/docs/Fixed.docx
@@ -75,7 +75,7 @@
               <w:pStyle w:val="Compact"/>
             </w:pPr>
             <w:r>
-              <w:t xml:space="preserve">23</w:t>
+              <w:t xml:space="preserve">24</w:t>
             </w:r>
           </w:p>
         </w:tc>
@@ -123,7 +123,7 @@
               <w:pStyle w:val="Compact"/>
             </w:pPr>
             <w:r>
-              <w:t xml:space="preserve">2026-05-31</w:t>
+              <w:t xml:space="preserve">2026-06-02</w:t>
             </w:r>
           </w:p>
         </w:tc>
@@ -171,7 +171,94 @@
               <w:pStyle w:val="Compact"/>
             </w:pPr>
             <w:r>
-              <w:t xml:space="preserve">**r23: §11.4.19 received HRD-117 (Wave 7 T8 spec-doc) from Issues.md — closed because its deliverable is verified present in active spec V4 (§11.0/§32.2/§43; doc-only, product code already Fixed under HRD-116/118/119/120/121). Inserted after the HRD-116 Wave-7 cluster row. Prior r22: §11.4.90 + §11.4.19 atomic Obsolete→Fixed migration — received the 4</w:t>
+              <w:t xml:space="preserve">**r24: §11.4.19 atomic Issues→Fixed migration of HRD-115 (Wave 7 Slack channel adapter — live round-trip proven on a real workspace: send + Socket-Mode inbound + Tier-1 reply-delivery + threading; participant-handle resolution fixed</w:t>
+            </w:r>
+            <w:r>
+              <w:t xml:space="preserve"> </w:t>
+            </w:r>
+            <w:r>
+              <w:rPr>
+                <w:rStyle w:val="VerbatimChar"/>
+              </w:rPr>
+              <w:t xml:space="preserve">7e7a04e</w:t>
+            </w:r>
+            <w:r>
+              <w:t xml:space="preserve">; evidence</w:t>
+            </w:r>
+            <w:r>
+              <w:t xml:space="preserve"> </w:t>
+            </w:r>
+            <w:r>
+              <w:rPr>
+                <w:rStyle w:val="VerbatimChar"/>
+              </w:rPr>
+              <w:t xml:space="preserve">docs/qa/HRD-115-LIVE-roundtrip-2026-06-02T08-43-55Z/</w:t>
+            </w:r>
+            <w:r>
+              <w:t xml:space="preserve">) + HRD-081 (podman-compose</w:t>
+            </w:r>
+            <w:r>
+              <w:t xml:space="preserve"> </w:t>
+            </w:r>
+            <w:r>
+              <w:rPr>
+                <w:rStyle w:val="VerbatimChar"/>
+              </w:rPr>
+              <w:t xml:space="preserve">--wait</w:t>
+            </w:r>
+            <w:r>
+              <w:t xml:space="preserve">/</w:t>
+            </w:r>
+            <w:r>
+              <w:rPr>
+                <w:rStyle w:val="VerbatimChar"/>
+              </w:rPr>
+              <w:t xml:space="preserve">Status()</w:t>
+            </w:r>
+            <w:r>
+              <w:t xml:space="preserve">-ps-parse fix landed upstream in</w:t>
+            </w:r>
+            <w:r>
+              <w:t xml:space="preserve"> </w:t>
+            </w:r>
+            <w:r>
+              <w:rPr>
+                <w:rStyle w:val="VerbatimChar"/>
+              </w:rPr>
+              <w:t xml:space="preserve">digital.vasic.containers</w:t>
+            </w:r>
+            <w:r>
+              <w:t xml:space="preserve"> </w:t>
+            </w:r>
+            <w:r>
+              <w:rPr>
+                <w:rStyle w:val="VerbatimChar"/>
+              </w:rPr>
+              <w:t xml:space="preserve">222fb90</w:t>
+            </w:r>
+            <w:r>
+              <w:t xml:space="preserve">, Herald pointer bumped</w:t>
+            </w:r>
+            <w:r>
+              <w:t xml:space="preserve"> </w:t>
+            </w:r>
+            <w:r>
+              <w:rPr>
+                <w:rStyle w:val="VerbatimChar"/>
+              </w:rPr>
+              <w:t xml:space="preserve">af48c97</w:t>
+            </w:r>
+            <w:r>
+              <w:t xml:space="preserve">, live-proven podman-compose 1.5.0/podman 5.8.2 per §11.4.76 extend-upstream). Both inserted as the top two Recently-fixed rows. HRD-159 (cross-channel empty-CC-reply delivery gap) STAYS OPEN in Issues.md — the seeding fix (</w:t>
+            </w:r>
+            <w:r>
+              <w:rPr>
+                <w:rStyle w:val="VerbatimChar"/>
+              </w:rPr>
+              <w:t xml:space="preserve">f0c7858</w:t>
+            </w:r>
+            <w:r>
+              <w:t xml:space="preserve">, bootstrapPrompt standing-contract + deterministic test) landed but real-Claude-honors-contract live confirmation is still pending. Prior r23: §11.4.19 received HRD-117 (Wave 7 T8 spec-doc) from Issues.md — closed because its deliverable is verified present in active spec V4 (§11.0/§32.2/§43; doc-only, product code already Fixed under HRD-116/118/119/120/121). Inserted after the HRD-116 Wave-7 cluster row. Prior r22: §11.4.90 + §11.4.19 atomic Obsolete→Fixed migration — received the 4</w:t>
             </w:r>
             <w:r>
               <w:t xml:space="preserve"> </w:t>
@@ -465,7 +552,7 @@
               <w:pStyle w:val="Compact"/>
             </w:pPr>
             <w:r>
-              <w:t xml:space="preserve">10 still open in</w:t>
+              <w:t xml:space="preserve">8 still open in</w:t>
             </w:r>
             <w:r>
               <w:t xml:space="preserve"> </w:t>
@@ -477,7 +564,22 @@
               <w:t xml:space="preserve">Issues.md</w:t>
             </w:r>
             <w:r>
-              <w:t xml:space="preserve">: HRD-008, HRD-081 (operator/upstream); HRD-115 (Slack adapter — operator-gated on LIVE round-trip evidence per §107.x); HRD-117 (spec doc-only); HRD-131, HRD-150, HRD-155, HRD-156, HRD-157, HRD-158 (ATMOSphere/SSoT externally gated). The 4 Obsolete HRDs (HRD-143/144/145 + HRD-015) migrated here per §11.4.90.</w:t>
+              <w:t xml:space="preserve">: HRD-008 (operator quickstart-compose validation); HRD-159 (cross-channel empty-CC-reply delivery gap — seeding fix</w:t>
+            </w:r>
+            <w:r>
+              <w:t xml:space="preserve"> </w:t>
+            </w:r>
+            <w:r>
+              <w:rPr>
+                <w:rStyle w:val="VerbatimChar"/>
+              </w:rPr>
+              <w:t xml:space="preserve">f0c7858</w:t>
+            </w:r>
+            <w:r>
+              <w:t xml:space="preserve"> </w:t>
+            </w:r>
+            <w:r>
+              <w:t xml:space="preserve">landed, awaiting real-Claude live confirmation); HRD-131, HRD-150, HRD-155, HRD-156, HRD-157, HRD-158 (ATMOSphere/SSoT externally gated). HRD-115 (Slack adapter) + HRD-081 (podman-compose fix) migrated to Fixed here per §11.4.19 r24. The 4 Obsolete HRDs (HRD-143/144/145 + HRD-015) migrated here per §11.4.90.</w:t>
             </w:r>
           </w:p>
         </w:tc>
@@ -501,7 +603,7 @@
               <w:pStyle w:val="Compact"/>
             </w:pPr>
             <w:r>
-              <w:t xml:space="preserve">HRD-001..HRD-007, HRD-009, HRD-009b, HRD-010, HRD-011, HRD-012, HRD-013, HRD-014, HRD-015, HRD-016, HRD-017, HRD-018, HRD-019..HRD-025, HRD-026, HRD-027, HRD-028, HRD-029..HRD-056, HRD-080, HRD-085..HRD-089, HRD-090, HRD-092, HRD-093, HRD-094, HRD-095, HRD-096, HRD-097, HRD-098, HRD-099, HRD-100, HRD-110, HRD-111, HRD-112, HRD-113, HRD-114, HRD-116, HRD-118, HRD-119, HRD-120, HRD-121, HRD-122, HRD-123, HRD-124, HRD-125, HRD-126, HRD-127, HRD-128, HRD-129, HRD-130, HRD-132, HRD-133, HRD-134, HRD-135, HRD-136, HRD-137, HRD-138, HRD-139, HRD-140, HRD-141, HRD-142, HRD-143, HRD-144, HRD-145, HRD-146, HRD-147, HRD-148, HRD-149, HRD-151, HRD-152, HRD-153, HRD-154</w:t>
+              <w:t xml:space="preserve">HRD-001..HRD-007, HRD-009, HRD-009b, HRD-010, HRD-011, HRD-012, HRD-013, HRD-014, HRD-015, HRD-016, HRD-017, HRD-018, HRD-019..HRD-025, HRD-026, HRD-027, HRD-028, HRD-029..HRD-056, HRD-080, HRD-081, HRD-085..HRD-089, HRD-090, HRD-092, HRD-093, HRD-094, HRD-095, HRD-096, HRD-097, HRD-098, HRD-099, HRD-100, HRD-110, HRD-111, HRD-112, HRD-113, HRD-114, HRD-115, HRD-116, HRD-118, HRD-119, HRD-120, HRD-121, HRD-122, HRD-123, HRD-124, HRD-125, HRD-126, HRD-127, HRD-128, HRD-129, HRD-130, HRD-132, HRD-133, HRD-134, HRD-135, HRD-136, HRD-137, HRD-138, HRD-139, HRD-140, HRD-141, HRD-142, HRD-143, HRD-144, HRD-145, HRD-146, HRD-147, HRD-148, HRD-149, HRD-151, HRD-152, HRD-153, HRD-154</w:t>
             </w:r>
           </w:p>
         </w:tc>
@@ -567,7 +669,64 @@
               <w:t xml:space="preserve"> </w:t>
             </w:r>
             <w:r>
-              <w:t xml:space="preserve">Runner wiring (Wave 3b live — 7-stage pipeline + e2e E37-E42); universal §11.4.73 + §11.4.74 mandates propagated; I6 gate refined; Wave 2 flavor scaffolds (HRD-092..097) closed atomically; Wave 3a substrate (HRD-099 commons_auth JWT verifier) + 2 live REST routes (HRD-028, HRD-098) closed atomically.</w:t>
+              <w:t xml:space="preserve">Runner wiring (Wave 3b live — 7-stage pipeline + e2e E37-E42); universal §11.4.73 + §11.4.74 mandates propagated; I6 gate refined; Wave 2 flavor scaffolds (HRD-092..097) closed atomically; Wave 3a substrate (HRD-099 commons_auth JWT verifier) + 2 live REST routes (HRD-028, HRD-098) closed atomically. r24 (§11.4.19): HRD-115 (Wave 7 Slack channel adapter — live round-trip proven, send + Socket-Mode inbound + Tier-1 reply-delivery + threading, participant-handle resolution fix</w:t>
+            </w:r>
+            <w:r>
+              <w:t xml:space="preserve"> </w:t>
+            </w:r>
+            <w:r>
+              <w:rPr>
+                <w:rStyle w:val="VerbatimChar"/>
+              </w:rPr>
+              <w:t xml:space="preserve">7e7a04e</w:t>
+            </w:r>
+            <w:r>
+              <w:t xml:space="preserve">) + HRD-081 (podman-compose</w:t>
+            </w:r>
+            <w:r>
+              <w:t xml:space="preserve"> </w:t>
+            </w:r>
+            <w:r>
+              <w:rPr>
+                <w:rStyle w:val="VerbatimChar"/>
+              </w:rPr>
+              <w:t xml:space="preserve">--wait</w:t>
+            </w:r>
+            <w:r>
+              <w:t xml:space="preserve">/</w:t>
+            </w:r>
+            <w:r>
+              <w:rPr>
+                <w:rStyle w:val="VerbatimChar"/>
+              </w:rPr>
+              <w:t xml:space="preserve">Status()</w:t>
+            </w:r>
+            <w:r>
+              <w:t xml:space="preserve">-ps-parse fix landed upstream containers</w:t>
+            </w:r>
+            <w:r>
+              <w:t xml:space="preserve"> </w:t>
+            </w:r>
+            <w:r>
+              <w:rPr>
+                <w:rStyle w:val="VerbatimChar"/>
+              </w:rPr>
+              <w:t xml:space="preserve">222fb90</w:t>
+            </w:r>
+            <w:r>
+              <w:t xml:space="preserve">, Herald pointer</w:t>
+            </w:r>
+            <w:r>
+              <w:t xml:space="preserve"> </w:t>
+            </w:r>
+            <w:r>
+              <w:rPr>
+                <w:rStyle w:val="VerbatimChar"/>
+              </w:rPr>
+              <w:t xml:space="preserve">af48c97</w:t>
+            </w:r>
+            <w:r>
+              <w:t xml:space="preserve">, live podman-compose 1.5.0/podman 5.8.2).</w:t>
             </w:r>
           </w:p>
         </w:tc>
@@ -762,6 +921,439 @@
             </w:pPr>
             <w:r>
               <w:t xml:space="preserve">Reference</w:t>
+            </w:r>
+          </w:p>
+        </w:tc>
+      </w:tr>
+      <w:tr>
+        <w:tc>
+          <w:tcPr/>
+          <w:p>
+            <w:pPr>
+              <w:pStyle w:val="Compact"/>
+            </w:pPr>
+            <w:r>
+              <w:t xml:space="preserve">HRD-115</w:t>
+            </w:r>
+          </w:p>
+        </w:tc>
+        <w:tc>
+          <w:tcPr/>
+          <w:p>
+            <w:pPr>
+              <w:pStyle w:val="Compact"/>
+            </w:pPr>
+            <w:r>
+              <w:t xml:space="preserve">task</w:t>
+            </w:r>
+          </w:p>
+        </w:tc>
+        <w:tc>
+          <w:tcPr/>
+          <w:p>
+            <w:pPr>
+              <w:pStyle w:val="Compact"/>
+            </w:pPr>
+            <w:r>
+              <w:t xml:space="preserve">high</w:t>
+            </w:r>
+          </w:p>
+        </w:tc>
+        <w:tc>
+          <w:tcPr/>
+          <w:p>
+            <w:pPr>
+              <w:pStyle w:val="Compact"/>
+            </w:pPr>
+            <w:r>
+              <w:t xml:space="preserve">Claude</w:t>
+            </w:r>
+          </w:p>
+        </w:tc>
+        <w:tc>
+          <w:tcPr/>
+          <w:p>
+            <w:pPr>
+              <w:pStyle w:val="Compact"/>
+            </w:pPr>
+            <w:r>
+              <w:t xml:space="preserve">@milos85vasic</w:t>
+            </w:r>
+          </w:p>
+        </w:tc>
+        <w:tc>
+          <w:tcPr/>
+          <w:p>
+            <w:pPr>
+              <w:pStyle w:val="Compact"/>
+            </w:pPr>
+            <w:r>
+              <w:t xml:space="preserve">Wave 7 T6 Slack channel adapter (Socket Mode) reaches live parity with Telegram —</w:t>
+            </w:r>
+            <w:r>
+              <w:t xml:space="preserve"> </w:t>
+            </w:r>
+            <w:r>
+              <w:rPr>
+                <w:rStyle w:val="VerbatimChar"/>
+              </w:rPr>
+              <w:t xml:space="preserve">commons_messaging/channels/slack/</w:t>
+            </w:r>
+            <w:r>
+              <w:t xml:space="preserve"> </w:t>
+            </w:r>
+            <w:r>
+              <w:t xml:space="preserve">implements</w:t>
+            </w:r>
+            <w:r>
+              <w:t xml:space="preserve"> </w:t>
+            </w:r>
+            <w:r>
+              <w:rPr>
+                <w:rStyle w:val="VerbatimChar"/>
+              </w:rPr>
+              <w:t xml:space="preserve">channels.Channel</w:t>
+            </w:r>
+            <w:r>
+              <w:t xml:space="preserve"> </w:t>
+            </w:r>
+            <w:r>
+              <w:t xml:space="preserve">(Send / SendReply+thread_ts / Subscribe via Socket Mode / BotSelfIdentity / content-addressed DownloadAttachment / HealthCheck) and is now LIVE-ROUND-TRIP PROVEN on a real workspace: send + Socket-Mode inbound + Tier-1 reply-DELIVERY + threading all confirmed end-to-end. Participant-handle resolution fixed this session (ids→@handles, sender=poster not channel). Residual empty-CC-reply is NOT a Slack defect (cross-channel, tgram has it too) — tracked by HRD-159.</w:t>
+            </w:r>
+          </w:p>
+        </w:tc>
+        <w:tc>
+          <w:tcPr/>
+          <w:p>
+            <w:pPr>
+              <w:pStyle w:val="Compact"/>
+            </w:pPr>
+            <w:r>
+              <w:t xml:space="preserve">2026-06-02</w:t>
+            </w:r>
+          </w:p>
+        </w:tc>
+        <w:tc>
+          <w:tcPr/>
+          <w:p>
+            <w:pPr>
+              <w:pStyle w:val="Compact"/>
+            </w:pPr>
+            <w:r>
+              <w:rPr>
+                <w:rStyle w:val="VerbatimChar"/>
+              </w:rPr>
+              <w:t xml:space="preserve">7e7a04e</w:t>
+            </w:r>
+            <w:r>
+              <w:t xml:space="preserve"> </w:t>
+            </w:r>
+            <w:r>
+              <w:t xml:space="preserve">(participant-handle resolution fix; live round-trip evidence captured)</w:t>
+            </w:r>
+          </w:p>
+        </w:tc>
+        <w:tc>
+          <w:tcPr/>
+          <w:p>
+            <w:pPr>
+              <w:pStyle w:val="Compact"/>
+            </w:pPr>
+            <w:r>
+              <w:t xml:space="preserve">live round-trip evidence</w:t>
+            </w:r>
+            <w:r>
+              <w:t xml:space="preserve"> </w:t>
+            </w:r>
+            <w:r>
+              <w:rPr>
+                <w:rStyle w:val="VerbatimChar"/>
+              </w:rPr>
+              <w:t xml:space="preserve">docs/qa/HRD-115-LIVE-roundtrip-2026-06-02T08-43-55Z/</w:t>
+            </w:r>
+            <w:r>
+              <w:t xml:space="preserve"> </w:t>
+            </w:r>
+            <w:r>
+              <w:t xml:space="preserve">(+</w:t>
+            </w:r>
+            <w:r>
+              <w:t xml:space="preserve"> </w:t>
+            </w:r>
+            <w:r>
+              <w:rPr>
+                <w:rStyle w:val="VerbatimChar"/>
+              </w:rPr>
+              <w:t xml:space="preserve">docs/qa/HRD-115-LIVE-20260602T074249Z/</w:t>
+            </w:r>
+            <w:r>
+              <w:t xml:space="preserve">); §11.4.104 IdentityResolver in the listen path; e2e E124-E131; residual empty-CC-reply tracked by HRD-159; spec V3 §11 Slack + §32.2; Catalogue-Check: reuse</w:t>
+            </w:r>
+            <w:r>
+              <w:t xml:space="preserve"> </w:t>
+            </w:r>
+            <w:r>
+              <w:rPr>
+                <w:rStyle w:val="VerbatimChar"/>
+              </w:rPr>
+              <w:t xml:space="preserve">slack-go/slack@209ec09</w:t>
+            </w:r>
+            <w:r>
+              <w:t xml:space="preserve">.</w:t>
+            </w:r>
+          </w:p>
+        </w:tc>
+      </w:tr>
+      <w:tr>
+        <w:tc>
+          <w:tcPr/>
+          <w:p>
+            <w:pPr>
+              <w:pStyle w:val="Compact"/>
+            </w:pPr>
+            <w:r>
+              <w:t xml:space="preserve">HRD-081</w:t>
+            </w:r>
+          </w:p>
+        </w:tc>
+        <w:tc>
+          <w:tcPr/>
+          <w:p>
+            <w:pPr>
+              <w:pStyle w:val="Compact"/>
+            </w:pPr>
+            <w:r>
+              <w:t xml:space="preserve">task</w:t>
+            </w:r>
+          </w:p>
+        </w:tc>
+        <w:tc>
+          <w:tcPr/>
+          <w:p>
+            <w:pPr>
+              <w:pStyle w:val="Compact"/>
+            </w:pPr>
+            <w:r>
+              <w:t xml:space="preserve">low</w:t>
+            </w:r>
+          </w:p>
+        </w:tc>
+        <w:tc>
+          <w:tcPr/>
+          <w:p>
+            <w:pPr>
+              <w:pStyle w:val="Compact"/>
+            </w:pPr>
+            <w:r>
+              <w:t xml:space="preserve">Claude</w:t>
+            </w:r>
+          </w:p>
+        </w:tc>
+        <w:tc>
+          <w:tcPr/>
+          <w:p>
+            <w:pPr>
+              <w:pStyle w:val="Compact"/>
+            </w:pPr>
+            <w:r>
+              <w:t xml:space="preserve">@milos85vasic</w:t>
+            </w:r>
+          </w:p>
+        </w:tc>
+        <w:tc>
+          <w:tcPr/>
+          <w:p>
+            <w:pPr>
+              <w:pStyle w:val="Compact"/>
+            </w:pPr>
+            <w:r>
+              <w:t xml:space="preserve">podman-compose runtime detection fixed upstream in</w:t>
+            </w:r>
+            <w:r>
+              <w:t xml:space="preserve"> </w:t>
+            </w:r>
+            <w:r>
+              <w:rPr>
+                <w:rStyle w:val="VerbatimChar"/>
+              </w:rPr>
+              <w:t xml:space="preserve">digital.vasic.containers/pkg/compose</w:t>
+            </w:r>
+            <w:r>
+              <w:t xml:space="preserve"> </w:t>
+            </w:r>
+            <w:r>
+              <w:t xml:space="preserve">— classify runtime and omit</w:t>
+            </w:r>
+            <w:r>
+              <w:t xml:space="preserve"> </w:t>
+            </w:r>
+            <w:r>
+              <w:rPr>
+                <w:rStyle w:val="VerbatimChar"/>
+              </w:rPr>
+              <w:t xml:space="preserve">--wait</w:t>
+            </w:r>
+            <w:r>
+              <w:t xml:space="preserve"> </w:t>
+            </w:r>
+            <w:r>
+              <w:t xml:space="preserve">for podman-compose (with host-side healthcheck polling fallback) plus fix</w:t>
+            </w:r>
+            <w:r>
+              <w:t xml:space="preserve"> </w:t>
+            </w:r>
+            <w:r>
+              <w:rPr>
+                <w:rStyle w:val="VerbatimChar"/>
+              </w:rPr>
+              <w:t xml:space="preserve">Status()</w:t>
+            </w:r>
+            <w:r>
+              <w:t xml:space="preserve"> </w:t>
+            </w:r>
+            <w:r>
+              <w:t xml:space="preserve">ps JSON parsing (the old docker-style</w:t>
+            </w:r>
+            <w:r>
+              <w:t xml:space="preserve"> </w:t>
+            </w:r>
+            <w:r>
+              <w:rPr>
+                <w:rStyle w:val="VerbatimChar"/>
+              </w:rPr>
+              <w:t xml:space="preserve">ps --format {{.Name}}</w:t>
+            </w:r>
+            <w:r>
+              <w:t xml:space="preserve"> </w:t>
+            </w:r>
+            <w:r>
+              <w:t xml:space="preserve">template errored against</w:t>
+            </w:r>
+            <w:r>
+              <w:t xml:space="preserve"> </w:t>
+            </w:r>
+            <w:r>
+              <w:rPr>
+                <w:rStyle w:val="VerbatimChar"/>
+              </w:rPr>
+              <w:t xml:space="preserve">podman ps</w:t>
+            </w:r>
+            <w:r>
+              <w:t xml:space="preserve"> </w:t>
+            </w:r>
+            <w:r>
+              <w:t xml:space="preserve">and reported 0 services). Per §11.4.76 the upstream submodule was extended, never reimplemented.</w:t>
+            </w:r>
+          </w:p>
+        </w:tc>
+        <w:tc>
+          <w:tcPr/>
+          <w:p>
+            <w:pPr>
+              <w:pStyle w:val="Compact"/>
+            </w:pPr>
+            <w:r>
+              <w:t xml:space="preserve">2026-06-02</w:t>
+            </w:r>
+          </w:p>
+        </w:tc>
+        <w:tc>
+          <w:tcPr/>
+          <w:p>
+            <w:pPr>
+              <w:pStyle w:val="Compact"/>
+            </w:pPr>
+            <w:r>
+              <w:rPr>
+                <w:rStyle w:val="VerbatimChar"/>
+              </w:rPr>
+              <w:t xml:space="preserve">af48c97</w:t>
+            </w:r>
+            <w:r>
+              <w:t xml:space="preserve"> </w:t>
+            </w:r>
+            <w:r>
+              <w:t xml:space="preserve">(Herald pointer bump) +</w:t>
+            </w:r>
+            <w:r>
+              <w:t xml:space="preserve"> </w:t>
+            </w:r>
+            <w:r>
+              <w:rPr>
+                <w:rStyle w:val="VerbatimChar"/>
+              </w:rPr>
+              <w:t xml:space="preserve">222fb90</w:t>
+            </w:r>
+            <w:r>
+              <w:t xml:space="preserve"> </w:t>
+            </w:r>
+            <w:r>
+              <w:t xml:space="preserve">(upstream containers fix)</w:t>
+            </w:r>
+          </w:p>
+        </w:tc>
+        <w:tc>
+          <w:tcPr/>
+          <w:p>
+            <w:pPr>
+              <w:pStyle w:val="Compact"/>
+            </w:pPr>
+            <w:r>
+              <w:t xml:space="preserve">§11.4.76 (extend upstream, never reimplement); deterministic tests</w:t>
+            </w:r>
+            <w:r>
+              <w:t xml:space="preserve"> </w:t>
+            </w:r>
+            <w:r>
+              <w:rPr>
+                <w:rStyle w:val="VerbatimChar"/>
+              </w:rPr>
+              <w:t xml:space="preserve">containers/pkg/compose/podman_compose_test.go</w:t>
+            </w:r>
+            <w:r>
+              <w:t xml:space="preserve"> </w:t>
+            </w:r>
+            <w:r>
+              <w:t xml:space="preserve">(argv-capture</w:t>
+            </w:r>
+            <w:r>
+              <w:t xml:space="preserve"> </w:t>
+            </w:r>
+            <w:r>
+              <w:rPr>
+                <w:rStyle w:val="VerbatimChar"/>
+              </w:rPr>
+              <w:t xml:space="preserve">--wait</w:t>
+            </w:r>
+            <w:r>
+              <w:t xml:space="preserve"> </w:t>
+            </w:r>
+            <w:r>
+              <w:t xml:space="preserve">matrix + ps JSON parser vs real fixture + paired negative</w:t>
+            </w:r>
+            <w:r>
+              <w:t xml:space="preserve"> </w:t>
+            </w:r>
+            <w:r>
+              <w:rPr>
+                <w:rStyle w:val="VerbatimChar"/>
+              </w:rPr>
+              <w:t xml:space="preserve">TestParsePodmanStatusJSON_NegativeOldParserMissesServices</w:t>
+            </w:r>
+            <w:r>
+              <w:t xml:space="preserve">); live-proven against podman-compose 1.5.0 / podman 5.8.2; evidence</w:t>
+            </w:r>
+            <w:r>
+              <w:t xml:space="preserve"> </w:t>
+            </w:r>
+            <w:r>
+              <w:rPr>
+                <w:rStyle w:val="VerbatimChar"/>
+              </w:rPr>
+              <w:t xml:space="preserve">docs/qa/HRD-081-20260602/evidence.md</w:t>
+            </w:r>
+            <w:r>
+              <w:t xml:space="preserve">.</w:t>
             </w:r>
           </w:p>
         </w:tc>

</xml_diff>